<commit_message>
Adds dynamic placeholders and robust DOCX table handling
Enables dynamic template rendering for clarification letters by introducing placeholders for region-specific data and row iteration. Improves DOCX processing by supporting nested and header/footer tables and enhancing placeholder detection and replacement, ensuring more flexible and accurate document generation.
</commit_message>
<xml_diff>
--- a/diamond_web/fixtures/default_templates/surat_klarifikasi.docx
+++ b/diamond_web/fixtures/default_templates/surat_klarifikasi.docx
@@ -1,6 +1,6 @@
 
 <file path=word/document.xml><?xml version="1.0" encoding="utf-8"?>
-<w:document xmlns:wpc="http://schemas.microsoft.com/office/word/2010/wordprocessingCanvas" xmlns:cx="http://schemas.microsoft.com/office/drawing/2014/chartex" xmlns:cx1="http://schemas.microsoft.com/office/drawing/2015/9/8/chartex" xmlns:cx2="http://schemas.microsoft.com/office/drawing/2015/10/21/chartex" xmlns:cx3="http://schemas.microsoft.com/office/drawing/2016/5/9/chartex" xmlns:cx4="http://schemas.microsoft.com/office/drawing/2016/5/10/chartex" xmlns:cx5="http://schemas.microsoft.com/office/drawing/2016/5/11/chartex" xmlns:cx6="http://schemas.microsoft.com/office/drawing/2016/5/12/chartex" xmlns:cx7="http://schemas.microsoft.com/office/drawing/2016/5/13/chartex" xmlns:cx8="http://schemas.microsoft.com/office/drawing/2016/5/14/chartex" xmlns:mc="http://schemas.openxmlformats.org/markup-compatibility/2006" xmlns:aink="http://schemas.microsoft.com/office/drawing/2016/ink" xmlns:am3d="http://schemas.microsoft.com/office/drawing/2017/model3d" xmlns:o="urn:schemas-microsoft-com:office:office" xmlns:r="http://schemas.openxmlformats.org/officeDocument/2006/relationships" xmlns:m="http://schemas.openxmlformats.org/officeDocument/2006/math" xmlns:v="urn:schemas-microsoft-com:vml" xmlns:wp14="http://schemas.microsoft.com/office/word/2010/wordprocessingDrawing" xmlns:wp="http://schemas.openxmlformats.org/drawingml/2006/wordprocessingDrawing" xmlns:w10="urn:schemas-microsoft-com:office:word" xmlns:w="http://schemas.openxmlformats.org/wordprocessingml/2006/main" xmlns:w14="http://schemas.microsoft.com/office/word/2010/wordml" xmlns:w15="http://schemas.microsoft.com/office/word/2012/wordml" xmlns:w16cex="http://schemas.microsoft.com/office/word/2018/wordml/cex" xmlns:w16cid="http://schemas.microsoft.com/office/word/2016/wordml/cid" xmlns:w16="http://schemas.microsoft.com/office/word/2018/wordml" xmlns:w16sdtdh="http://schemas.microsoft.com/office/word/2020/wordml/sdtdatahash" xmlns:w16se="http://schemas.microsoft.com/office/word/2015/wordml/symex" xmlns:wpg="http://schemas.microsoft.com/office/word/2010/wordprocessingGroup" xmlns:wpi="http://schemas.microsoft.com/office/word/2010/wordprocessingInk" xmlns:wne="http://schemas.microsoft.com/office/word/2006/wordml" xmlns:wps="http://schemas.microsoft.com/office/word/2010/wordprocessingShape" mc:Ignorable="w14 w15 w16se w16cid w16 w16cex w16sdtdh wp14">
+<w:document xmlns:wpc="http://schemas.microsoft.com/office/word/2010/wordprocessingCanvas" xmlns:cx="http://schemas.microsoft.com/office/drawing/2014/chartex" xmlns:cx1="http://schemas.microsoft.com/office/drawing/2015/9/8/chartex" xmlns:cx2="http://schemas.microsoft.com/office/drawing/2015/10/21/chartex" xmlns:cx3="http://schemas.microsoft.com/office/drawing/2016/5/9/chartex" xmlns:cx4="http://schemas.microsoft.com/office/drawing/2016/5/10/chartex" xmlns:cx5="http://schemas.microsoft.com/office/drawing/2016/5/11/chartex" xmlns:cx6="http://schemas.microsoft.com/office/drawing/2016/5/12/chartex" xmlns:cx7="http://schemas.microsoft.com/office/drawing/2016/5/13/chartex" xmlns:cx8="http://schemas.microsoft.com/office/drawing/2016/5/14/chartex" xmlns:mc="http://schemas.openxmlformats.org/markup-compatibility/2006" xmlns:aink="http://schemas.microsoft.com/office/drawing/2016/ink" xmlns:am3d="http://schemas.microsoft.com/office/drawing/2017/model3d" xmlns:o="urn:schemas-microsoft-com:office:office" xmlns:oel="http://schemas.microsoft.com/office/2019/extlst" xmlns:r="http://schemas.openxmlformats.org/officeDocument/2006/relationships" xmlns:m="http://schemas.openxmlformats.org/officeDocument/2006/math" xmlns:v="urn:schemas-microsoft-com:vml" xmlns:wp14="http://schemas.microsoft.com/office/word/2010/wordprocessingDrawing" xmlns:wp="http://schemas.openxmlformats.org/drawingml/2006/wordprocessingDrawing" xmlns:w10="urn:schemas-microsoft-com:office:word" xmlns:w="http://schemas.openxmlformats.org/wordprocessingml/2006/main" xmlns:w14="http://schemas.microsoft.com/office/word/2010/wordml" xmlns:w15="http://schemas.microsoft.com/office/word/2012/wordml" xmlns:w16cex="http://schemas.microsoft.com/office/word/2018/wordml/cex" xmlns:w16cid="http://schemas.microsoft.com/office/word/2016/wordml/cid" xmlns:w16="http://schemas.microsoft.com/office/word/2018/wordml" xmlns:w16du="http://schemas.microsoft.com/office/word/2023/wordml/word16du" xmlns:w16sdtdh="http://schemas.microsoft.com/office/word/2020/wordml/sdtdatahash" xmlns:w16sdtfl="http://schemas.microsoft.com/office/word/2024/wordml/sdtformatlock" xmlns:w16se="http://schemas.microsoft.com/office/word/2015/wordml/symex" xmlns:wpg="http://schemas.microsoft.com/office/word/2010/wordprocessingGroup" xmlns:wpi="http://schemas.microsoft.com/office/word/2010/wordprocessingInk" xmlns:wne="http://schemas.microsoft.com/office/word/2006/wordml" xmlns:wps="http://schemas.microsoft.com/office/word/2010/wordprocessingShape" mc:Ignorable="w14 w15 w16se w16cid w16 w16cex w16sdtdh w16sdtfl w16du wp14">
   <w:body>
     <w:p/>
     <w:tbl>
@@ -482,7 +482,15 @@
                 <w:rFonts w:eastAsia="Arial"/>
                 <w:lang w:val="en-US"/>
               </w:rPr>
-              <w:t>atas Penyampaian Data dari Pemerintah Daerah</w:t>
+              <w:t xml:space="preserve">atas Penyampaian Data dari </w:t>
+            </w:r>
+            <w:r>
+              <w:rPr>
+                <w:rFonts w:eastAsia="Arial"/>
+                <w:highlight w:val="yellow"/>
+                <w:lang w:val="en-US"/>
+              </w:rPr>
+              <w:t>Pemerintah Daerah</w:t>
             </w:r>
             <w:r>
               <w:rPr>
@@ -494,10 +502,9 @@
             <w:r>
               <w:rPr>
                 <w:rFonts w:eastAsia="Arial"/>
-                <w:highlight w:val="yellow"/>
                 <w:lang w:val="en-US"/>
               </w:rPr>
-              <w:t>Kabupaten Bangkalan</w:t>
+              <w:t>{{nama_ilap}}</w:t>
             </w:r>
             <w:r>
               <w:rPr>
@@ -534,13 +541,7 @@
         <w:t xml:space="preserve"> </w:t>
       </w:r>
       <w:r>
-        <w:rPr>
-          <w:highlight w:val="yellow"/>
-        </w:rPr>
-        <w:t>Kabupaten Pemalang</w:t>
-      </w:r>
-      <w:r>
-        <w:t xml:space="preserve"> </w:t>
+        <w:t>{{nama_ilap}}</w:t>
       </w:r>
     </w:p>
     <w:p>
@@ -555,32 +556,7 @@
         <w:rPr>
           <w:highlight w:val="yellow"/>
         </w:rPr>
-        <w:t>Jl. Suro Hadikusumo No.1, Kebondalem, Kec. Pemalang</w:t>
-      </w:r>
-    </w:p>
-    <w:p>
-      <w:pPr>
-        <w:ind w:left="-170" w:right="57"/>
-        <w:jc w:val="both"/>
-      </w:pPr>
-      <w:r>
-        <w:rPr>
-          <w:highlight w:val="yellow"/>
-        </w:rPr>
-        <w:t>Kabupaten Pemalang</w:t>
-      </w:r>
-      <w:r>
-        <w:rPr>
-          <w:highlight w:val="yellow"/>
-          <w:lang w:val="en-US"/>
-        </w:rPr>
-        <w:t xml:space="preserve">, Provinsi </w:t>
-      </w:r>
-      <w:r>
-        <w:rPr>
-          <w:highlight w:val="yellow"/>
-        </w:rPr>
-        <w:t>Jawa Tengah</w:t>
+        <w:t>alamat</w:t>
       </w:r>
     </w:p>
     <w:p>
@@ -614,10 +590,7 @@
         <w:t xml:space="preserve"> </w:t>
       </w:r>
       <w:r>
-        <w:rPr>
-          <w:highlight w:val="yellow"/>
-        </w:rPr>
-        <w:t>Kabupaten Pemalang</w:t>
+        <w:t>{{nama_ilap}}</w:t>
       </w:r>
       <w:r>
         <w:rPr>
@@ -627,10 +600,9 @@
       </w:r>
       <w:r>
         <w:rPr>
-          <w:highlight w:val="yellow"/>
           <w:lang w:val="en-US"/>
         </w:rPr>
-        <w:t>35/PEMDA/2025</w:t>
+        <w:t>{{nomor_surat_pengantar}}</w:t>
       </w:r>
       <w:r>
         <w:rPr>
@@ -640,10 +612,9 @@
       </w:r>
       <w:r>
         <w:rPr>
-          <w:highlight w:val="yellow"/>
           <w:lang w:val="en-US"/>
         </w:rPr>
-        <w:t>05 Juni 2025</w:t>
+        <w:t>{{tanggal_surat_pengantar}}</w:t>
       </w:r>
       <w:r>
         <w:rPr>
@@ -716,61 +687,84 @@
         <w:rPr>
           <w:rFonts w:eastAsia="Arial" w:cs="Arial"/>
           <w:noProof/>
-        </w:rPr>
-      </w:pPr>
-      <w:r>
-        <w:rPr>
+          <w:highlight w:val="yellow"/>
+        </w:rPr>
+      </w:pPr>
+      <w:r>
+        <w:rPr>
+          <w:highlight w:val="yellow"/>
           <w:lang w:val="en-US"/>
         </w:rPr>
         <w:t>d</w:t>
       </w:r>
       <w:r>
         <w:rPr>
+          <w:highlight w:val="yellow"/>
           <w:lang w:val="en-US"/>
         </w:rPr>
         <w:t xml:space="preserve">ata sebagaimana dimaksud pada angka 1 tidak dapat </w:t>
       </w:r>
       <w:r>
+        <w:rPr>
+          <w:highlight w:val="yellow"/>
+        </w:rPr>
         <w:t xml:space="preserve">diproses karena tidak memiliki keterangan utama yang dibutuhkan sesuai dengan Lampiran Peraturan Menteri Keuangan </w:t>
       </w:r>
       <w:r>
         <w:rPr>
+          <w:highlight w:val="yellow"/>
           <w:lang w:val="en-US"/>
         </w:rPr>
         <w:t>n</w:t>
       </w:r>
       <w:r>
+        <w:rPr>
+          <w:highlight w:val="yellow"/>
+        </w:rPr>
         <w:t xml:space="preserve">omor PMK-228/PMK.03/2017 </w:t>
       </w:r>
       <w:r>
         <w:rPr>
+          <w:highlight w:val="yellow"/>
           <w:lang w:val="en-US"/>
         </w:rPr>
         <w:t>dan/atau</w:t>
       </w:r>
       <w:r>
+        <w:rPr>
+          <w:highlight w:val="yellow"/>
+        </w:rPr>
         <w:t xml:space="preserve"> Perjanjian Kerja Sama </w:t>
       </w:r>
       <w:r>
         <w:rPr>
+          <w:highlight w:val="yellow"/>
           <w:lang w:val="en-US"/>
         </w:rPr>
         <w:t xml:space="preserve">Optimalisasi Pemungutan Pajak Pusat dan Pajak Daerah (PKS OP4D) </w:t>
       </w:r>
       <w:r>
+        <w:rPr>
+          <w:highlight w:val="yellow"/>
+        </w:rPr>
         <w:t>antara DJP-DJPK</w:t>
       </w:r>
       <w:r>
         <w:rPr>
+          <w:highlight w:val="yellow"/>
           <w:lang w:val="en-US"/>
         </w:rPr>
         <w:t xml:space="preserve"> dan </w:t>
       </w:r>
       <w:r>
+        <w:rPr>
+          <w:highlight w:val="yellow"/>
+        </w:rPr>
         <w:t>Pemda</w:t>
       </w:r>
       <w:r>
         <w:rPr>
+          <w:highlight w:val="yellow"/>
           <w:lang w:val="en-US"/>
         </w:rPr>
         <w:t>;</w:t>
@@ -789,12 +783,14 @@
         <w:rPr>
           <w:rFonts w:eastAsia="Arial" w:cs="Arial"/>
           <w:noProof/>
+          <w:highlight w:val="yellow"/>
         </w:rPr>
       </w:pPr>
       <w:r>
         <w:rPr>
           <w:rFonts w:eastAsia="Arial" w:cs="Arial"/>
           <w:noProof/>
+          <w:highlight w:val="yellow"/>
           <w:lang w:val="en-US"/>
         </w:rPr>
         <w:t>d</w:t>
@@ -803,6 +799,7 @@
         <w:rPr>
           <w:rFonts w:eastAsia="Arial" w:cs="Arial"/>
           <w:noProof/>
+          <w:highlight w:val="yellow"/>
         </w:rPr>
         <w:t>ata</w:t>
       </w:r>
@@ -810,6 +807,7 @@
         <w:rPr>
           <w:rFonts w:eastAsia="Arial" w:cs="Arial"/>
           <w:noProof/>
+          <w:highlight w:val="yellow"/>
           <w:lang w:val="en-US"/>
         </w:rPr>
         <w:t xml:space="preserve"> </w:t>
@@ -818,6 +816,7 @@
         <w:rPr>
           <w:rFonts w:eastAsia="Arial" w:cs="Arial"/>
           <w:noProof/>
+          <w:highlight w:val="yellow"/>
         </w:rPr>
         <w:t>yang</w:t>
       </w:r>
@@ -825,6 +824,7 @@
         <w:rPr>
           <w:rFonts w:eastAsia="Arial" w:cs="Arial"/>
           <w:noProof/>
+          <w:highlight w:val="yellow"/>
           <w:lang w:val="en-US"/>
         </w:rPr>
         <w:t xml:space="preserve"> </w:t>
@@ -833,6 +833,7 @@
         <w:rPr>
           <w:rFonts w:eastAsia="Arial" w:cs="Arial"/>
           <w:noProof/>
+          <w:highlight w:val="yellow"/>
         </w:rPr>
         <w:t>perlu</w:t>
       </w:r>
@@ -840,6 +841,7 @@
         <w:rPr>
           <w:rFonts w:eastAsia="Arial" w:cs="Arial"/>
           <w:noProof/>
+          <w:highlight w:val="yellow"/>
           <w:lang w:val="en-US"/>
         </w:rPr>
         <w:t xml:space="preserve"> </w:t>
@@ -848,6 +850,7 @@
         <w:rPr>
           <w:rFonts w:eastAsia="Arial" w:cs="Arial"/>
           <w:noProof/>
+          <w:highlight w:val="yellow"/>
         </w:rPr>
         <w:t>dilakukan</w:t>
       </w:r>
@@ -855,6 +858,7 @@
         <w:rPr>
           <w:rFonts w:eastAsia="Arial" w:cs="Arial"/>
           <w:noProof/>
+          <w:highlight w:val="yellow"/>
           <w:lang w:val="en-US"/>
         </w:rPr>
         <w:t xml:space="preserve"> </w:t>
@@ -863,6 +867,7 @@
         <w:rPr>
           <w:rFonts w:eastAsia="Arial" w:cs="Arial"/>
           <w:noProof/>
+          <w:highlight w:val="yellow"/>
         </w:rPr>
         <w:t>klarifikasi</w:t>
       </w:r>
@@ -870,6 +875,7 @@
         <w:rPr>
           <w:rFonts w:eastAsia="Arial" w:cs="Arial"/>
           <w:noProof/>
+          <w:highlight w:val="yellow"/>
           <w:lang w:val="en-US"/>
         </w:rPr>
         <w:t xml:space="preserve"> </w:t>
@@ -878,6 +884,7 @@
         <w:rPr>
           <w:rFonts w:eastAsia="Arial" w:cs="Arial"/>
           <w:noProof/>
+          <w:highlight w:val="yellow"/>
         </w:rPr>
         <w:t>ke</w:t>
       </w:r>
@@ -885,6 +892,7 @@
         <w:rPr>
           <w:rFonts w:eastAsia="Arial" w:cs="Arial"/>
           <w:noProof/>
+          <w:highlight w:val="yellow"/>
           <w:lang w:val="en-US"/>
         </w:rPr>
         <w:t xml:space="preserve"> </w:t>
@@ -893,6 +901,7 @@
         <w:rPr>
           <w:rFonts w:eastAsia="Arial" w:cs="Arial"/>
           <w:noProof/>
+          <w:highlight w:val="yellow"/>
         </w:rPr>
         <w:t>Pemerintah</w:t>
       </w:r>
@@ -900,6 +909,7 @@
         <w:rPr>
           <w:rFonts w:eastAsia="Arial" w:cs="Arial"/>
           <w:noProof/>
+          <w:highlight w:val="yellow"/>
           <w:lang w:val="en-US"/>
         </w:rPr>
         <w:t xml:space="preserve"> </w:t>
@@ -908,6 +918,7 @@
         <w:rPr>
           <w:rFonts w:eastAsia="Arial" w:cs="Arial"/>
           <w:noProof/>
+          <w:highlight w:val="yellow"/>
         </w:rPr>
         <w:t>Daerah</w:t>
       </w:r>
@@ -915,6 +926,7 @@
         <w:rPr>
           <w:rFonts w:eastAsia="Arial" w:cs="Arial"/>
           <w:noProof/>
+          <w:highlight w:val="yellow"/>
           <w:lang w:val="en-US"/>
         </w:rPr>
         <w:t xml:space="preserve"> </w:t>
@@ -923,6 +935,7 @@
         <w:rPr>
           <w:rFonts w:eastAsia="Arial" w:cs="Arial"/>
           <w:noProof/>
+          <w:highlight w:val="yellow"/>
         </w:rPr>
         <w:t>terdapat</w:t>
       </w:r>
@@ -930,6 +943,7 @@
         <w:rPr>
           <w:rFonts w:eastAsia="Arial" w:cs="Arial"/>
           <w:noProof/>
+          <w:highlight w:val="yellow"/>
           <w:lang w:val="en-US"/>
         </w:rPr>
         <w:t xml:space="preserve"> </w:t>
@@ -938,6 +952,7 @@
         <w:rPr>
           <w:rFonts w:eastAsia="Arial" w:cs="Arial"/>
           <w:noProof/>
+          <w:highlight w:val="yellow"/>
         </w:rPr>
         <w:t>pad</w:t>
       </w:r>
@@ -945,6 +960,7 @@
         <w:rPr>
           <w:rFonts w:eastAsia="Arial" w:cs="Arial"/>
           <w:noProof/>
+          <w:highlight w:val="yellow"/>
           <w:lang w:val="en-US"/>
         </w:rPr>
         <w:t xml:space="preserve">a </w:t>
@@ -954,6 +970,7 @@
           <w:rFonts w:eastAsia="Arial" w:cs="Arial"/>
           <w:noProof/>
           <w:color w:val="00B0F0"/>
+          <w:highlight w:val="yellow"/>
           <w:u w:val="single"/>
           <w:lang w:val="en-US"/>
         </w:rPr>
@@ -963,6 +980,7 @@
         <w:rPr>
           <w:rFonts w:eastAsia="Arial" w:cs="Arial"/>
           <w:noProof/>
+          <w:highlight w:val="yellow"/>
           <w:lang w:val="en-US"/>
         </w:rPr>
         <w:t xml:space="preserve"> ini;</w:t>
@@ -1162,7 +1180,7 @@
     </w:p>
     <w:tbl>
       <w:tblPr>
-        <w:tblW w:w="5224" w:type="pct"/>
+        <w:tblW w:w="5386" w:type="pct"/>
         <w:tblInd w:w="-289" w:type="dxa"/>
         <w:tblBorders>
           <w:top w:val="single" w:sz="4" w:space="0" w:color="FFFFFF"/>
@@ -1173,22 +1191,20 @@
           <w:insideV w:val="single" w:sz="4" w:space="0" w:color="FFFFFF"/>
         </w:tblBorders>
         <w:shd w:val="clear" w:color="auto" w:fill="FFFFFF"/>
+        <w:tblLayout w:type="fixed"/>
         <w:tblLook w:val="04A0" w:firstRow="1" w:lastRow="0" w:firstColumn="1" w:lastColumn="0" w:noHBand="0" w:noVBand="1"/>
       </w:tblPr>
       <w:tblGrid>
-        <w:gridCol w:w="5226"/>
-        <w:gridCol w:w="4535"/>
-        <w:gridCol w:w="6"/>
+        <w:gridCol w:w="5814"/>
+        <w:gridCol w:w="4251"/>
       </w:tblGrid>
       <w:tr>
         <w:trPr>
-          <w:gridAfter w:val="1"/>
-          <w:wAfter w:w="151" w:type="pct"/>
           <w:trHeight w:val="218"/>
         </w:trPr>
         <w:tc>
           <w:tcPr>
-            <w:tcW w:w="2677" w:type="pct"/>
+            <w:tcW w:w="2888" w:type="pct"/>
             <w:shd w:val="clear" w:color="auto" w:fill="FFFFFF" w:themeFill="background1"/>
           </w:tcPr>
           <w:p>
@@ -1204,12 +1220,12 @@
         </w:tc>
         <w:tc>
           <w:tcPr>
-            <w:tcW w:w="2172" w:type="pct"/>
+            <w:tcW w:w="2112" w:type="pct"/>
             <w:shd w:val="clear" w:color="auto" w:fill="FFFFFF" w:themeFill="background1"/>
           </w:tcPr>
           <w:p>
             <w:pPr>
-              <w:ind w:left="-103"/>
+              <w:ind w:left="-110"/>
               <w:rPr>
                 <w:rFonts w:eastAsia="Arial" w:cs="Arial"/>
                 <w:noProof/>
@@ -1225,13 +1241,11 @@
       </w:tr>
       <w:tr>
         <w:trPr>
-          <w:gridAfter w:val="1"/>
-          <w:wAfter w:w="151" w:type="pct"/>
           <w:trHeight w:val="218"/>
         </w:trPr>
         <w:tc>
           <w:tcPr>
-            <w:tcW w:w="2677" w:type="pct"/>
+            <w:tcW w:w="2888" w:type="pct"/>
             <w:shd w:val="clear" w:color="auto" w:fill="FFFFFF" w:themeFill="background1"/>
           </w:tcPr>
           <w:p>
@@ -1245,7 +1259,7 @@
         </w:tc>
         <w:tc>
           <w:tcPr>
-            <w:tcW w:w="2172" w:type="pct"/>
+            <w:tcW w:w="2112" w:type="pct"/>
             <w:shd w:val="clear" w:color="auto" w:fill="FFFFFF" w:themeFill="background1"/>
           </w:tcPr>
           <w:p>
@@ -1328,13 +1342,11 @@
       </w:tr>
       <w:tr>
         <w:trPr>
-          <w:gridAfter w:val="1"/>
-          <w:wAfter w:w="151" w:type="pct"/>
           <w:trHeight w:val="303"/>
         </w:trPr>
         <w:tc>
           <w:tcPr>
-            <w:tcW w:w="2677" w:type="pct"/>
+            <w:tcW w:w="2888" w:type="pct"/>
             <w:shd w:val="clear" w:color="auto" w:fill="FFFFFF" w:themeFill="background1"/>
           </w:tcPr>
           <w:p>
@@ -1348,7 +1360,7 @@
         </w:tc>
         <w:tc>
           <w:tcPr>
-            <w:tcW w:w="2172" w:type="pct"/>
+            <w:tcW w:w="2112" w:type="pct"/>
             <w:shd w:val="clear" w:color="auto" w:fill="FFFFFF" w:themeFill="background1"/>
           </w:tcPr>
           <w:p>
@@ -1360,47 +1372,8 @@
                 <w:u w:val="single"/>
               </w:rPr>
             </w:pPr>
-            <w:hyperlink r:id="rId13" w:history="1">
-              <w:r>
-                <w:rPr>
-                  <w:rStyle w:val="Hyperlink"/>
-                  <w:rFonts w:cs="Arial"/>
-                  <w:noProof/>
-                  <w:color w:val="auto"/>
-                  <w:u w:val="none"/>
-                  <w:lang w:val="en-US"/>
-                </w:rPr>
-                <w:t>M</w:t>
-              </w:r>
-              <w:r>
-                <w:rPr>
-                  <w:rStyle w:val="Hyperlink"/>
-                  <w:noProof/>
-                  <w:color w:val="auto"/>
-                  <w:u w:val="none"/>
-                </w:rPr>
-                <w:t>ax</w:t>
-              </w:r>
-            </w:hyperlink>
             <w:r>
-              <w:rPr>
-                <w:rStyle w:val="Hyperlink"/>
-                <w:rFonts w:cs="Arial"/>
-                <w:noProof/>
-                <w:color w:val="auto"/>
-                <w:u w:val="none"/>
-                <w:lang w:val="en-US"/>
-              </w:rPr>
-              <w:t xml:space="preserve"> </w:t>
-            </w:r>
-            <w:r>
-              <w:rPr>
-                <w:rStyle w:val="Hyperlink"/>
-                <w:noProof/>
-                <w:color w:val="auto"/>
-                <w:u w:val="none"/>
-              </w:rPr>
-              <w:t>Darmawan</w:t>
+              <w:t>Eddy Wahyudi</w:t>
             </w:r>
           </w:p>
         </w:tc>
@@ -1419,7 +1392,7 @@
         <w:tc>
           <w:tcPr>
             <w:tcW w:w="5000" w:type="pct"/>
-            <w:gridSpan w:val="3"/>
+            <w:gridSpan w:val="2"/>
             <w:tcBorders>
               <w:top w:val="nil"/>
               <w:left w:val="nil"/>
@@ -1611,7 +1584,7 @@
         <w:tc>
           <w:tcPr>
             <w:tcW w:w="5000" w:type="pct"/>
-            <w:gridSpan w:val="3"/>
+            <w:gridSpan w:val="2"/>
             <w:tcBorders>
               <w:top w:val="nil"/>
               <w:left w:val="nil"/>
@@ -1632,7 +1605,7 @@
           </w:p>
           <w:p>
             <w:pPr>
-              <w:ind w:left="-284"/>
+              <w:ind w:left="-284" w:right="-106"/>
               <w:jc w:val="center"/>
               <w:rPr>
                 <w:b/>
@@ -1664,7 +1637,7 @@
           </w:p>
           <w:p>
             <w:pPr>
-              <w:ind w:left="-284"/>
+              <w:ind w:left="-284" w:right="-106"/>
               <w:jc w:val="center"/>
               <w:rPr>
                 <w:b/>
@@ -1696,6 +1669,23 @@
           </w:p>
           <w:p>
             <w:pPr>
+              <w:ind w:left="-284" w:right="-106"/>
+              <w:jc w:val="center"/>
+              <w:rPr>
+                <w:b/>
+                <w:bCs/>
+              </w:rPr>
+            </w:pPr>
+            <w:r>
+              <w:rPr>
+                <w:b/>
+                <w:bCs/>
+              </w:rPr>
+              <w:t>{{nama_ilap}}</w:t>
+            </w:r>
+          </w:p>
+          <w:p>
+            <w:pPr>
               <w:ind w:left="-284"/>
               <w:jc w:val="both"/>
               <w:rPr>
@@ -1706,17 +1696,18 @@
           </w:p>
           <w:tbl>
             <w:tblPr>
-              <w:tblW w:w="9535" w:type="dxa"/>
+              <w:tblW w:w="9956" w:type="dxa"/>
+              <w:tblLayout w:type="fixed"/>
               <w:tblLook w:val="04A0" w:firstRow="1" w:lastRow="0" w:firstColumn="1" w:lastColumn="0" w:noHBand="0" w:noVBand="1"/>
             </w:tblPr>
             <w:tblGrid>
-              <w:gridCol w:w="536"/>
-              <w:gridCol w:w="1281"/>
-              <w:gridCol w:w="1415"/>
-              <w:gridCol w:w="1097"/>
-              <w:gridCol w:w="1177"/>
-              <w:gridCol w:w="1364"/>
-              <w:gridCol w:w="2665"/>
+              <w:gridCol w:w="742"/>
+              <w:gridCol w:w="1418"/>
+              <w:gridCol w:w="1134"/>
+              <w:gridCol w:w="1134"/>
+              <w:gridCol w:w="1559"/>
+              <w:gridCol w:w="1559"/>
+              <w:gridCol w:w="2410"/>
             </w:tblGrid>
             <w:tr>
               <w:trPr>
@@ -1725,7 +1716,7 @@
               </w:trPr>
               <w:tc>
                 <w:tcPr>
-                  <w:tcW w:w="536" w:type="dxa"/>
+                  <w:tcW w:w="742" w:type="dxa"/>
                   <w:tcBorders>
                     <w:top w:val="single" w:sz="4" w:space="0" w:color="auto"/>
                     <w:left w:val="single" w:sz="4" w:space="0" w:color="auto"/>
@@ -1763,7 +1754,7 @@
               </w:tc>
               <w:tc>
                 <w:tcPr>
-                  <w:tcW w:w="1158" w:type="dxa"/>
+                  <w:tcW w:w="1418" w:type="dxa"/>
                   <w:tcBorders>
                     <w:top w:val="single" w:sz="4" w:space="0" w:color="auto"/>
                     <w:left w:val="nil"/>
@@ -1801,7 +1792,7 @@
               </w:tc>
               <w:tc>
                 <w:tcPr>
-                  <w:tcW w:w="1415" w:type="dxa"/>
+                  <w:tcW w:w="1134" w:type="dxa"/>
                   <w:tcBorders>
                     <w:top w:val="single" w:sz="4" w:space="0" w:color="auto"/>
                     <w:left w:val="nil"/>
@@ -1839,7 +1830,7 @@
               </w:tc>
               <w:tc>
                 <w:tcPr>
-                  <w:tcW w:w="1097" w:type="dxa"/>
+                  <w:tcW w:w="1134" w:type="dxa"/>
                   <w:tcBorders>
                     <w:top w:val="single" w:sz="4" w:space="0" w:color="auto"/>
                     <w:left w:val="nil"/>
@@ -1877,7 +1868,7 @@
               </w:tc>
               <w:tc>
                 <w:tcPr>
-                  <w:tcW w:w="1177" w:type="dxa"/>
+                  <w:tcW w:w="1559" w:type="dxa"/>
                   <w:tcBorders>
                     <w:top w:val="single" w:sz="4" w:space="0" w:color="auto"/>
                     <w:left w:val="nil"/>
@@ -1926,7 +1917,7 @@
               </w:tc>
               <w:tc>
                 <w:tcPr>
-                  <w:tcW w:w="1364" w:type="dxa"/>
+                  <w:tcW w:w="1559" w:type="dxa"/>
                   <w:tcBorders>
                     <w:top w:val="single" w:sz="4" w:space="0" w:color="auto"/>
                     <w:left w:val="nil"/>
@@ -1975,7 +1966,7 @@
               </w:tc>
               <w:tc>
                 <w:tcPr>
-                  <w:tcW w:w="2788" w:type="dxa"/>
+                  <w:tcW w:w="2410" w:type="dxa"/>
                   <w:tcBorders>
                     <w:top w:val="single" w:sz="4" w:space="0" w:color="auto"/>
                     <w:left w:val="nil"/>
@@ -2029,46 +2020,13 @@
               </w:trPr>
               <w:tc>
                 <w:tcPr>
-                  <w:tcW w:w="536" w:type="dxa"/>
+                  <w:tcW w:w="742" w:type="dxa"/>
                   <w:tcBorders>
                     <w:top w:val="nil"/>
                     <w:left w:val="single" w:sz="4" w:space="0" w:color="auto"/>
                     <w:bottom w:val="single" w:sz="4" w:space="0" w:color="auto"/>
                     <w:right w:val="single" w:sz="4" w:space="0" w:color="auto"/>
                   </w:tcBorders>
-                  <w:shd w:val="clear" w:color="auto" w:fill="auto"/>
-                  <w:vAlign w:val="center"/>
-                  <w:hideMark/>
-                </w:tcPr>
-                <w:p>
-                  <w:pPr>
-                    <w:jc w:val="center"/>
-                    <w:rPr>
-                      <w:rFonts w:eastAsia="Times New Roman" w:cs="Arial"/>
-                      <w:highlight w:val="yellow"/>
-                      <w:lang w:val="en-ID" w:eastAsia="en-ID"/>
-                    </w:rPr>
-                  </w:pPr>
-                  <w:r>
-                    <w:rPr>
-                      <w:rFonts w:eastAsia="Times New Roman" w:cs="Arial"/>
-                      <w:highlight w:val="yellow"/>
-                      <w:lang w:val="en-ID" w:eastAsia="en-ID"/>
-                    </w:rPr>
-                    <w:t>1</w:t>
-                  </w:r>
-                </w:p>
-              </w:tc>
-              <w:tc>
-                <w:tcPr>
-                  <w:tcW w:w="1158" w:type="dxa"/>
-                  <w:tcBorders>
-                    <w:top w:val="nil"/>
-                    <w:left w:val="nil"/>
-                    <w:bottom w:val="single" w:sz="4" w:space="0" w:color="auto"/>
-                    <w:right w:val="single" w:sz="4" w:space="0" w:color="auto"/>
-                  </w:tcBorders>
-                  <w:shd w:val="clear" w:color="auto" w:fill="auto"/>
                   <w:vAlign w:val="center"/>
                 </w:tcPr>
                 <w:p>
@@ -2076,65 +2034,27 @@
                     <w:jc w:val="center"/>
                     <w:rPr>
                       <w:rFonts w:eastAsia="Times New Roman" w:cs="Arial"/>
-                      <w:highlight w:val="yellow"/>
                       <w:lang w:val="en-ID" w:eastAsia="en-ID"/>
                     </w:rPr>
                   </w:pPr>
                   <w:r>
                     <w:rPr>
-                      <w:highlight w:val="yellow"/>
+                      <w:rFonts w:eastAsia="Times New Roman" w:cs="Arial"/>
+                      <w:lang w:val="en-ID" w:eastAsia="en-ID"/>
                     </w:rPr>
-                    <w:t>Kabupaten Pemalang</w:t>
+                    <w:t>{{row.nomor}}</w:t>
                   </w:r>
                 </w:p>
               </w:tc>
               <w:tc>
                 <w:tcPr>
-                  <w:tcW w:w="1415" w:type="dxa"/>
+                  <w:tcW w:w="1418" w:type="dxa"/>
                   <w:tcBorders>
                     <w:top w:val="nil"/>
                     <w:left w:val="nil"/>
                     <w:bottom w:val="single" w:sz="4" w:space="0" w:color="auto"/>
                     <w:right w:val="single" w:sz="4" w:space="0" w:color="auto"/>
                   </w:tcBorders>
-                  <w:shd w:val="clear" w:color="auto" w:fill="auto"/>
-                  <w:vAlign w:val="center"/>
-                </w:tcPr>
-                <w:p>
-                  <w:pPr>
-                    <w:rPr>
-                      <w:rFonts w:eastAsia="Times New Roman" w:cs="Arial"/>
-                      <w:highlight w:val="yellow"/>
-                      <w:lang w:val="en-US" w:eastAsia="en-ID"/>
-                    </w:rPr>
-                  </w:pPr>
-                  <w:r>
-                    <w:rPr>
-                      <w:rFonts w:cs="Arial"/>
-                      <w:highlight w:val="yellow"/>
-                    </w:rPr>
-                    <w:t xml:space="preserve">Data </w:t>
-                  </w:r>
-                  <w:r>
-                    <w:rPr>
-                      <w:rFonts w:cs="Arial"/>
-                      <w:highlight w:val="yellow"/>
-                      <w:lang w:val="en-US"/>
-                    </w:rPr>
-                    <w:t>Kepemilikan Hotel</w:t>
-                  </w:r>
-                </w:p>
-              </w:tc>
-              <w:tc>
-                <w:tcPr>
-                  <w:tcW w:w="1097" w:type="dxa"/>
-                  <w:tcBorders>
-                    <w:top w:val="nil"/>
-                    <w:left w:val="nil"/>
-                    <w:bottom w:val="single" w:sz="4" w:space="0" w:color="auto"/>
-                    <w:right w:val="single" w:sz="4" w:space="0" w:color="auto"/>
-                  </w:tcBorders>
-                  <w:shd w:val="clear" w:color="auto" w:fill="auto"/>
                   <w:vAlign w:val="center"/>
                 </w:tcPr>
                 <w:p>
@@ -2142,30 +2062,54 @@
                     <w:jc w:val="center"/>
                     <w:rPr>
                       <w:rFonts w:eastAsia="Times New Roman" w:cs="Arial"/>
-                      <w:highlight w:val="yellow"/>
-                      <w:lang w:val="en-US" w:eastAsia="en-ID"/>
+                      <w:lang w:val="en-ID" w:eastAsia="en-ID"/>
                     </w:rPr>
                   </w:pPr>
                   <w:r>
                     <w:rPr>
-                      <w:rFonts w:cs="Arial"/>
-                      <w:highlight w:val="yellow"/>
-                      <w:lang w:val="en-US"/>
+                      <w:rFonts w:eastAsia="Times New Roman" w:cs="Arial"/>
+                      <w:lang w:val="en-ID" w:eastAsia="en-ID"/>
                     </w:rPr>
-                    <w:t>2024</w:t>
+                    <w:t>{{nama_ilap}}</w:t>
                   </w:r>
                 </w:p>
               </w:tc>
               <w:tc>
                 <w:tcPr>
-                  <w:tcW w:w="1177" w:type="dxa"/>
+                  <w:tcW w:w="1134" w:type="dxa"/>
                   <w:tcBorders>
                     <w:top w:val="nil"/>
                     <w:left w:val="nil"/>
                     <w:bottom w:val="single" w:sz="4" w:space="0" w:color="auto"/>
                     <w:right w:val="single" w:sz="4" w:space="0" w:color="auto"/>
                   </w:tcBorders>
-                  <w:shd w:val="clear" w:color="auto" w:fill="auto"/>
+                  <w:vAlign w:val="center"/>
+                </w:tcPr>
+                <w:p>
+                  <w:pPr>
+                    <w:rPr>
+                      <w:rFonts w:eastAsia="Times New Roman" w:cs="Arial"/>
+                      <w:lang w:val="en-US" w:eastAsia="en-ID"/>
+                    </w:rPr>
+                  </w:pPr>
+                  <w:r>
+                    <w:rPr>
+                      <w:rFonts w:eastAsia="Times New Roman" w:cs="Arial"/>
+                      <w:lang w:val="en-US" w:eastAsia="en-ID"/>
+                    </w:rPr>
+                    <w:t>{{row.sub_jenis_data}}</w:t>
+                  </w:r>
+                </w:p>
+              </w:tc>
+              <w:tc>
+                <w:tcPr>
+                  <w:tcW w:w="1134" w:type="dxa"/>
+                  <w:tcBorders>
+                    <w:top w:val="nil"/>
+                    <w:left w:val="nil"/>
+                    <w:bottom w:val="single" w:sz="4" w:space="0" w:color="auto"/>
+                    <w:right w:val="single" w:sz="4" w:space="0" w:color="auto"/>
+                  </w:tcBorders>
                   <w:vAlign w:val="center"/>
                 </w:tcPr>
                 <w:p>
@@ -2173,30 +2117,27 @@
                     <w:jc w:val="center"/>
                     <w:rPr>
                       <w:rFonts w:eastAsia="Times New Roman" w:cs="Arial"/>
-                      <w:highlight w:val="yellow"/>
-                      <w:lang w:val="en-ID" w:eastAsia="en-ID"/>
+                      <w:lang w:val="en-US" w:eastAsia="en-ID"/>
                     </w:rPr>
                   </w:pPr>
                   <w:r>
                     <w:rPr>
                       <w:rFonts w:eastAsia="Times New Roman" w:cs="Arial"/>
-                      <w:highlight w:val="yellow"/>
-                      <w:lang w:val="en-ID" w:eastAsia="en-ID"/>
+                      <w:lang w:val="en-US" w:eastAsia="en-ID"/>
                     </w:rPr>
-                    <w:t>100</w:t>
+                    <w:t>{{row.periode_data}}</w:t>
                   </w:r>
                 </w:p>
               </w:tc>
               <w:tc>
                 <w:tcPr>
-                  <w:tcW w:w="1364" w:type="dxa"/>
+                  <w:tcW w:w="1559" w:type="dxa"/>
                   <w:tcBorders>
                     <w:top w:val="nil"/>
                     <w:left w:val="nil"/>
                     <w:bottom w:val="single" w:sz="4" w:space="0" w:color="auto"/>
                     <w:right w:val="single" w:sz="4" w:space="0" w:color="auto"/>
                   </w:tcBorders>
-                  <w:shd w:val="clear" w:color="auto" w:fill="auto"/>
                   <w:vAlign w:val="center"/>
                 </w:tcPr>
                 <w:p>
@@ -2204,153 +2145,41 @@
                     <w:jc w:val="center"/>
                     <w:rPr>
                       <w:rFonts w:eastAsia="Times New Roman" w:cs="Arial"/>
-                      <w:highlight w:val="yellow"/>
                       <w:lang w:val="en-ID" w:eastAsia="en-ID"/>
                     </w:rPr>
                   </w:pPr>
                   <w:r>
                     <w:rPr>
                       <w:rFonts w:eastAsia="Times New Roman" w:cs="Arial"/>
-                      <w:highlight w:val="yellow"/>
                       <w:lang w:val="en-ID" w:eastAsia="en-ID"/>
                     </w:rPr>
-                    <w:t>20</w:t>
+                    <w:t>{{</w:t>
+                  </w:r>
+                  <w:r>
+                    <w:rPr>
+                      <w:rFonts w:eastAsia="Times New Roman" w:cs="Arial"/>
+                      <w:lang w:val="en-ID" w:eastAsia="en-ID"/>
+                    </w:rPr>
+                    <w:t>row.jumlah_baris_diterima</w:t>
+                  </w:r>
+                  <w:r>
+                    <w:rPr>
+                      <w:rFonts w:eastAsia="Times New Roman" w:cs="Arial"/>
+                      <w:lang w:val="en-ID" w:eastAsia="en-ID"/>
+                    </w:rPr>
+                    <w:t>}}</w:t>
                   </w:r>
                 </w:p>
               </w:tc>
               <w:tc>
                 <w:tcPr>
-                  <w:tcW w:w="2788" w:type="dxa"/>
+                  <w:tcW w:w="1559" w:type="dxa"/>
                   <w:tcBorders>
                     <w:top w:val="nil"/>
                     <w:left w:val="nil"/>
                     <w:bottom w:val="single" w:sz="4" w:space="0" w:color="auto"/>
                     <w:right w:val="single" w:sz="4" w:space="0" w:color="auto"/>
                   </w:tcBorders>
-                  <w:shd w:val="clear" w:color="auto" w:fill="auto"/>
-                  <w:vAlign w:val="center"/>
-                </w:tcPr>
-                <w:p>
-                  <w:pPr>
-                    <w:rPr>
-                      <w:rFonts w:cs="Arial"/>
-                      <w:highlight w:val="yellow"/>
-                      <w:lang w:val="en-US"/>
-                    </w:rPr>
-                  </w:pPr>
-                  <w:r>
-                    <w:rPr>
-                      <w:rFonts w:cs="Arial"/>
-                      <w:highlight w:val="yellow"/>
-                      <w:lang w:val="en-US"/>
-                    </w:rPr>
-                    <w:t>K</w:t>
-                  </w:r>
-                  <w:r>
-                    <w:rPr>
-                      <w:rFonts w:cs="Arial"/>
-                      <w:highlight w:val="yellow"/>
-                    </w:rPr>
-                    <w:t>olom:</w:t>
-                  </w:r>
-                  <w:r>
-                    <w:rPr>
-                      <w:rFonts w:cs="Arial"/>
-                      <w:highlight w:val="yellow"/>
-                    </w:rPr>
-                    <w:br/>
-                    <w:t xml:space="preserve">1. </w:t>
-                  </w:r>
-                  <w:r>
-                    <w:rPr>
-                      <w:rFonts w:cs="Arial"/>
-                      <w:highlight w:val="yellow"/>
-                      <w:lang w:val="en-US"/>
-                    </w:rPr>
-                    <w:t>Alamat Pemilik</w:t>
-                  </w:r>
-                  <w:r>
-                    <w:rPr>
-                      <w:rFonts w:cs="Arial"/>
-                      <w:highlight w:val="yellow"/>
-                    </w:rPr>
-                    <w:br/>
-                    <w:t xml:space="preserve">2. </w:t>
-                  </w:r>
-                  <w:r>
-                    <w:rPr>
-                      <w:rFonts w:cs="Arial"/>
-                      <w:highlight w:val="yellow"/>
-                      <w:lang w:val="en-US"/>
-                    </w:rPr>
-                    <w:t>Jumlah Pajak</w:t>
-                  </w:r>
-                </w:p>
-                <w:p>
-                  <w:pPr>
-                    <w:rPr>
-                      <w:rFonts w:eastAsia="Times New Roman" w:cs="Arial"/>
-                      <w:highlight w:val="yellow"/>
-                      <w:lang w:val="en-ID" w:eastAsia="en-ID"/>
-                    </w:rPr>
-                  </w:pPr>
-                  <w:r>
-                    <w:rPr>
-                      <w:rFonts w:eastAsia="Times New Roman" w:cs="Arial"/>
-                      <w:highlight w:val="yellow"/>
-                      <w:lang w:val="en-US" w:eastAsia="en-ID"/>
-                    </w:rPr>
-                    <w:t>tidak diisi secara lengkap</w:t>
-                  </w:r>
-                </w:p>
-              </w:tc>
-            </w:tr>
-            <w:tr>
-              <w:trPr>
-                <w:trHeight w:val="1260"/>
-              </w:trPr>
-              <w:tc>
-                <w:tcPr>
-                  <w:tcW w:w="536" w:type="dxa"/>
-                  <w:tcBorders>
-                    <w:top w:val="single" w:sz="4" w:space="0" w:color="auto"/>
-                    <w:left w:val="single" w:sz="4" w:space="0" w:color="auto"/>
-                    <w:bottom w:val="single" w:sz="4" w:space="0" w:color="auto"/>
-                    <w:right w:val="single" w:sz="4" w:space="0" w:color="auto"/>
-                  </w:tcBorders>
-                  <w:shd w:val="clear" w:color="auto" w:fill="auto"/>
-                  <w:vAlign w:val="center"/>
-                  <w:hideMark/>
-                </w:tcPr>
-                <w:p>
-                  <w:pPr>
-                    <w:jc w:val="center"/>
-                    <w:rPr>
-                      <w:rFonts w:eastAsia="Times New Roman" w:cs="Arial"/>
-                      <w:highlight w:val="yellow"/>
-                      <w:lang w:val="en-ID" w:eastAsia="en-ID"/>
-                    </w:rPr>
-                  </w:pPr>
-                  <w:r>
-                    <w:rPr>
-                      <w:rFonts w:eastAsia="Times New Roman" w:cs="Arial"/>
-                      <w:highlight w:val="yellow"/>
-                      <w:lang w:val="en-ID" w:eastAsia="en-ID"/>
-                    </w:rPr>
-                    <w:t>2</w:t>
-                  </w:r>
-                </w:p>
-              </w:tc>
-              <w:tc>
-                <w:tcPr>
-                  <w:tcW w:w="1158" w:type="dxa"/>
-                  <w:tcBorders>
-                    <w:top w:val="single" w:sz="4" w:space="0" w:color="auto"/>
-                    <w:left w:val="nil"/>
-                    <w:bottom w:val="single" w:sz="4" w:space="0" w:color="auto"/>
-                    <w:right w:val="single" w:sz="4" w:space="0" w:color="auto"/>
-                  </w:tcBorders>
-                  <w:shd w:val="clear" w:color="auto" w:fill="auto"/>
                   <w:vAlign w:val="center"/>
                 </w:tcPr>
                 <w:p>
@@ -2358,455 +2187,36 @@
                     <w:jc w:val="center"/>
                     <w:rPr>
                       <w:rFonts w:eastAsia="Times New Roman" w:cs="Arial"/>
-                      <w:highlight w:val="yellow"/>
                       <w:lang w:val="en-ID" w:eastAsia="en-ID"/>
                     </w:rPr>
                   </w:pPr>
                   <w:r>
                     <w:rPr>
-                      <w:highlight w:val="yellow"/>
+                      <w:rFonts w:eastAsia="Times New Roman" w:cs="Arial"/>
+                      <w:lang w:val="en-ID" w:eastAsia="en-ID"/>
                     </w:rPr>
-                    <w:t>Kabupaten Pemalang</w:t>
+                    <w:t>{{row.jumlah_baris_tidak_lengkap}}</w:t>
                   </w:r>
                 </w:p>
               </w:tc>
               <w:tc>
                 <w:tcPr>
-                  <w:tcW w:w="1415" w:type="dxa"/>
+                  <w:tcW w:w="2410" w:type="dxa"/>
                   <w:tcBorders>
-                    <w:top w:val="single" w:sz="4" w:space="0" w:color="auto"/>
+                    <w:top w:val="nil"/>
                     <w:left w:val="nil"/>
                     <w:bottom w:val="single" w:sz="4" w:space="0" w:color="auto"/>
                     <w:right w:val="single" w:sz="4" w:space="0" w:color="auto"/>
                   </w:tcBorders>
-                  <w:shd w:val="clear" w:color="auto" w:fill="auto"/>
                   <w:vAlign w:val="center"/>
                 </w:tcPr>
                 <w:p>
                   <w:pPr>
                     <w:rPr>
                       <w:rFonts w:eastAsia="Times New Roman" w:cs="Arial"/>
-                      <w:highlight w:val="yellow"/>
                       <w:lang w:val="en-ID" w:eastAsia="en-ID"/>
                     </w:rPr>
                   </w:pPr>
-                  <w:r>
-                    <w:rPr>
-                      <w:rFonts w:cs="Arial"/>
-                      <w:highlight w:val="yellow"/>
-                    </w:rPr>
-                    <w:t>Data Surat Izin Usaha</w:t>
-                  </w:r>
-                </w:p>
-              </w:tc>
-              <w:tc>
-                <w:tcPr>
-                  <w:tcW w:w="1097" w:type="dxa"/>
-                  <w:tcBorders>
-                    <w:top w:val="single" w:sz="4" w:space="0" w:color="auto"/>
-                    <w:left w:val="nil"/>
-                    <w:bottom w:val="single" w:sz="4" w:space="0" w:color="auto"/>
-                    <w:right w:val="single" w:sz="4" w:space="0" w:color="auto"/>
-                  </w:tcBorders>
-                  <w:shd w:val="clear" w:color="auto" w:fill="auto"/>
-                  <w:vAlign w:val="center"/>
-                </w:tcPr>
-                <w:p>
-                  <w:pPr>
-                    <w:jc w:val="center"/>
-                    <w:rPr>
-                      <w:rFonts w:eastAsia="Times New Roman" w:cs="Arial"/>
-                      <w:highlight w:val="yellow"/>
-                      <w:lang w:val="en-US" w:eastAsia="en-ID"/>
-                    </w:rPr>
-                  </w:pPr>
-                  <w:r>
-                    <w:rPr>
-                      <w:rFonts w:cs="Arial"/>
-                      <w:highlight w:val="yellow"/>
-                    </w:rPr>
-                    <w:t>202</w:t>
-                  </w:r>
-                  <w:r>
-                    <w:rPr>
-                      <w:rFonts w:cs="Arial"/>
-                      <w:highlight w:val="yellow"/>
-                      <w:lang w:val="en-US"/>
-                    </w:rPr>
-                    <w:t>4</w:t>
-                  </w:r>
-                </w:p>
-              </w:tc>
-              <w:tc>
-                <w:tcPr>
-                  <w:tcW w:w="1177" w:type="dxa"/>
-                  <w:tcBorders>
-                    <w:top w:val="single" w:sz="4" w:space="0" w:color="auto"/>
-                    <w:left w:val="nil"/>
-                    <w:bottom w:val="single" w:sz="4" w:space="0" w:color="auto"/>
-                    <w:right w:val="single" w:sz="4" w:space="0" w:color="auto"/>
-                  </w:tcBorders>
-                  <w:shd w:val="clear" w:color="auto" w:fill="auto"/>
-                  <w:vAlign w:val="center"/>
-                </w:tcPr>
-                <w:p>
-                  <w:pPr>
-                    <w:jc w:val="center"/>
-                    <w:rPr>
-                      <w:rFonts w:eastAsia="Times New Roman" w:cs="Arial"/>
-                      <w:highlight w:val="yellow"/>
-                      <w:lang w:val="en-ID" w:eastAsia="en-ID"/>
-                    </w:rPr>
-                  </w:pPr>
-                  <w:r>
-                    <w:rPr>
-                      <w:rFonts w:cs="Arial"/>
-                      <w:highlight w:val="yellow"/>
-                    </w:rPr>
-                    <w:t>4996</w:t>
-                  </w:r>
-                </w:p>
-              </w:tc>
-              <w:tc>
-                <w:tcPr>
-                  <w:tcW w:w="1364" w:type="dxa"/>
-                  <w:tcBorders>
-                    <w:top w:val="single" w:sz="4" w:space="0" w:color="auto"/>
-                    <w:left w:val="nil"/>
-                    <w:bottom w:val="single" w:sz="4" w:space="0" w:color="auto"/>
-                    <w:right w:val="single" w:sz="4" w:space="0" w:color="auto"/>
-                  </w:tcBorders>
-                  <w:shd w:val="clear" w:color="auto" w:fill="auto"/>
-                  <w:vAlign w:val="center"/>
-                </w:tcPr>
-                <w:p>
-                  <w:pPr>
-                    <w:jc w:val="center"/>
-                    <w:rPr>
-                      <w:rFonts w:eastAsia="Times New Roman" w:cs="Arial"/>
-                      <w:highlight w:val="yellow"/>
-                      <w:lang w:val="en-ID" w:eastAsia="en-ID"/>
-                    </w:rPr>
-                  </w:pPr>
-                  <w:r>
-                    <w:rPr>
-                      <w:rFonts w:cs="Arial"/>
-                      <w:highlight w:val="yellow"/>
-                    </w:rPr>
-                    <w:t>4996</w:t>
-                  </w:r>
-                </w:p>
-              </w:tc>
-              <w:tc>
-                <w:tcPr>
-                  <w:tcW w:w="2788" w:type="dxa"/>
-                  <w:tcBorders>
-                    <w:top w:val="single" w:sz="4" w:space="0" w:color="auto"/>
-                    <w:left w:val="nil"/>
-                    <w:bottom w:val="single" w:sz="4" w:space="0" w:color="auto"/>
-                    <w:right w:val="single" w:sz="4" w:space="0" w:color="auto"/>
-                  </w:tcBorders>
-                  <w:shd w:val="clear" w:color="auto" w:fill="auto"/>
-                  <w:vAlign w:val="center"/>
-                </w:tcPr>
-                <w:p>
-                  <w:pPr>
-                    <w:rPr>
-                      <w:rFonts w:eastAsia="Times New Roman" w:cs="Arial"/>
-                      <w:highlight w:val="yellow"/>
-                      <w:lang w:val="en-ID" w:eastAsia="en-ID"/>
-                    </w:rPr>
-                  </w:pPr>
-                  <w:r>
-                    <w:rPr>
-                      <w:rFonts w:cs="Arial"/>
-                      <w:highlight w:val="yellow"/>
-                    </w:rPr>
-                    <w:t xml:space="preserve">Tidak </w:t>
-                  </w:r>
-                  <w:r>
-                    <w:rPr>
-                      <w:rFonts w:cs="Arial"/>
-                      <w:highlight w:val="yellow"/>
-                      <w:lang w:val="en-US"/>
-                    </w:rPr>
-                    <w:t>terdapat</w:t>
-                  </w:r>
-                  <w:r>
-                    <w:rPr>
-                      <w:rFonts w:cs="Arial"/>
-                      <w:highlight w:val="yellow"/>
-                    </w:rPr>
-                    <w:t xml:space="preserve"> kolom:</w:t>
-                  </w:r>
-                  <w:r>
-                    <w:rPr>
-                      <w:rFonts w:cs="Arial"/>
-                      <w:highlight w:val="yellow"/>
-                    </w:rPr>
-                    <w:br/>
-                  </w:r>
-                  <w:r>
-                    <w:rPr>
-                      <w:rFonts w:cs="Arial"/>
-                      <w:highlight w:val="yellow"/>
-                      <w:lang w:val="en-US"/>
-                    </w:rPr>
-                    <w:t>1</w:t>
-                  </w:r>
-                  <w:r>
-                    <w:rPr>
-                      <w:rFonts w:cs="Arial"/>
-                      <w:highlight w:val="yellow"/>
-                    </w:rPr>
-                    <w:t xml:space="preserve">. Nama Pemilik </w:t>
-                  </w:r>
-                  <w:r>
-                    <w:rPr>
-                      <w:rFonts w:cs="Arial"/>
-                      <w:highlight w:val="yellow"/>
-                    </w:rPr>
-                    <w:br/>
-                  </w:r>
-                  <w:r>
-                    <w:rPr>
-                      <w:rFonts w:cs="Arial"/>
-                      <w:highlight w:val="yellow"/>
-                      <w:lang w:val="en-US"/>
-                    </w:rPr>
-                    <w:t>2</w:t>
-                  </w:r>
-                  <w:r>
-                    <w:rPr>
-                      <w:rFonts w:cs="Arial"/>
-                      <w:highlight w:val="yellow"/>
-                    </w:rPr>
-                    <w:t>. Alamat Pemilik</w:t>
-                  </w:r>
-                </w:p>
-              </w:tc>
-            </w:tr>
-            <w:tr>
-              <w:trPr>
-                <w:trHeight w:val="1260"/>
-              </w:trPr>
-              <w:tc>
-                <w:tcPr>
-                  <w:tcW w:w="536" w:type="dxa"/>
-                  <w:tcBorders>
-                    <w:top w:val="single" w:sz="4" w:space="0" w:color="auto"/>
-                    <w:left w:val="single" w:sz="4" w:space="0" w:color="auto"/>
-                    <w:bottom w:val="single" w:sz="4" w:space="0" w:color="auto"/>
-                    <w:right w:val="single" w:sz="4" w:space="0" w:color="auto"/>
-                  </w:tcBorders>
-                  <w:shd w:val="clear" w:color="auto" w:fill="auto"/>
-                  <w:vAlign w:val="center"/>
-                </w:tcPr>
-                <w:p>
-                  <w:pPr>
-                    <w:jc w:val="center"/>
-                    <w:rPr>
-                      <w:rFonts w:eastAsia="Times New Roman" w:cs="Arial"/>
-                      <w:highlight w:val="yellow"/>
-                      <w:lang w:val="en-ID" w:eastAsia="en-ID"/>
-                    </w:rPr>
-                  </w:pPr>
-                  <w:r>
-                    <w:rPr>
-                      <w:rFonts w:eastAsia="Times New Roman" w:cs="Arial"/>
-                      <w:highlight w:val="yellow"/>
-                      <w:lang w:val="en-ID" w:eastAsia="en-ID"/>
-                    </w:rPr>
-                    <w:t>3</w:t>
-                  </w:r>
-                </w:p>
-              </w:tc>
-              <w:tc>
-                <w:tcPr>
-                  <w:tcW w:w="1158" w:type="dxa"/>
-                  <w:tcBorders>
-                    <w:top w:val="single" w:sz="4" w:space="0" w:color="auto"/>
-                    <w:left w:val="nil"/>
-                    <w:bottom w:val="single" w:sz="4" w:space="0" w:color="auto"/>
-                    <w:right w:val="single" w:sz="4" w:space="0" w:color="auto"/>
-                  </w:tcBorders>
-                  <w:shd w:val="clear" w:color="auto" w:fill="auto"/>
-                  <w:vAlign w:val="center"/>
-                </w:tcPr>
-                <w:p>
-                  <w:pPr>
-                    <w:jc w:val="center"/>
-                    <w:rPr>
-                      <w:highlight w:val="yellow"/>
-                    </w:rPr>
-                  </w:pPr>
-                  <w:r>
-                    <w:rPr>
-                      <w:highlight w:val="yellow"/>
-                    </w:rPr>
-                    <w:t>Kabupaten Pemalang</w:t>
-                  </w:r>
-                </w:p>
-              </w:tc>
-              <w:tc>
-                <w:tcPr>
-                  <w:tcW w:w="1415" w:type="dxa"/>
-                  <w:tcBorders>
-                    <w:top w:val="single" w:sz="4" w:space="0" w:color="auto"/>
-                    <w:left w:val="nil"/>
-                    <w:bottom w:val="single" w:sz="4" w:space="0" w:color="auto"/>
-                    <w:right w:val="single" w:sz="4" w:space="0" w:color="auto"/>
-                  </w:tcBorders>
-                  <w:shd w:val="clear" w:color="auto" w:fill="auto"/>
-                  <w:vAlign w:val="center"/>
-                </w:tcPr>
-                <w:p>
-                  <w:pPr>
-                    <w:rPr>
-                      <w:rFonts w:cs="Arial"/>
-                      <w:highlight w:val="yellow"/>
-                      <w:lang w:val="en-US"/>
-                    </w:rPr>
-                  </w:pPr>
-                  <w:r>
-                    <w:rPr>
-                      <w:rFonts w:cs="Arial"/>
-                      <w:highlight w:val="yellow"/>
-                      <w:lang w:val="en-US"/>
-                    </w:rPr>
-                    <w:t xml:space="preserve">Data Kepemilikan </w:t>
-                  </w:r>
-                  <w:r>
-                    <w:rPr>
-                      <w:rFonts w:cs="Arial"/>
-                      <w:highlight w:val="yellow"/>
-                      <w:lang w:val="en-US"/>
-                    </w:rPr>
-                    <w:t>Restoran</w:t>
-                  </w:r>
-                </w:p>
-              </w:tc>
-              <w:tc>
-                <w:tcPr>
-                  <w:tcW w:w="1097" w:type="dxa"/>
-                  <w:tcBorders>
-                    <w:top w:val="single" w:sz="4" w:space="0" w:color="auto"/>
-                    <w:left w:val="nil"/>
-                    <w:bottom w:val="single" w:sz="4" w:space="0" w:color="auto"/>
-                    <w:right w:val="single" w:sz="4" w:space="0" w:color="auto"/>
-                  </w:tcBorders>
-                  <w:shd w:val="clear" w:color="auto" w:fill="auto"/>
-                  <w:vAlign w:val="center"/>
-                </w:tcPr>
-                <w:p>
-                  <w:pPr>
-                    <w:jc w:val="center"/>
-                    <w:rPr>
-                      <w:rFonts w:cs="Arial"/>
-                      <w:highlight w:val="yellow"/>
-                      <w:lang w:val="en-US"/>
-                    </w:rPr>
-                  </w:pPr>
-                  <w:r>
-                    <w:rPr>
-                      <w:rFonts w:cs="Arial"/>
-                      <w:highlight w:val="yellow"/>
-                      <w:lang w:val="en-US"/>
-                    </w:rPr>
-                    <w:t>2024</w:t>
-                  </w:r>
-                </w:p>
-              </w:tc>
-              <w:tc>
-                <w:tcPr>
-                  <w:tcW w:w="1177" w:type="dxa"/>
-                  <w:tcBorders>
-                    <w:top w:val="single" w:sz="4" w:space="0" w:color="auto"/>
-                    <w:left w:val="nil"/>
-                    <w:bottom w:val="single" w:sz="4" w:space="0" w:color="auto"/>
-                    <w:right w:val="single" w:sz="4" w:space="0" w:color="auto"/>
-                  </w:tcBorders>
-                  <w:shd w:val="clear" w:color="auto" w:fill="auto"/>
-                  <w:vAlign w:val="center"/>
-                </w:tcPr>
-                <w:p>
-                  <w:pPr>
-                    <w:jc w:val="center"/>
-                    <w:rPr>
-                      <w:rFonts w:cs="Arial"/>
-                      <w:highlight w:val="yellow"/>
-                      <w:lang w:val="en-US"/>
-                    </w:rPr>
-                  </w:pPr>
-                  <w:r>
-                    <w:rPr>
-                      <w:rFonts w:cs="Arial"/>
-                      <w:highlight w:val="yellow"/>
-                      <w:lang w:val="en-US"/>
-                    </w:rPr>
-                    <w:t>500</w:t>
-                  </w:r>
-                </w:p>
-              </w:tc>
-              <w:tc>
-                <w:tcPr>
-                  <w:tcW w:w="1364" w:type="dxa"/>
-                  <w:tcBorders>
-                    <w:top w:val="single" w:sz="4" w:space="0" w:color="auto"/>
-                    <w:left w:val="nil"/>
-                    <w:bottom w:val="single" w:sz="4" w:space="0" w:color="auto"/>
-                    <w:right w:val="single" w:sz="4" w:space="0" w:color="auto"/>
-                  </w:tcBorders>
-                  <w:shd w:val="clear" w:color="auto" w:fill="auto"/>
-                  <w:vAlign w:val="center"/>
-                </w:tcPr>
-                <w:p>
-                  <w:pPr>
-                    <w:jc w:val="center"/>
-                    <w:rPr>
-                      <w:rFonts w:cs="Arial"/>
-                      <w:highlight w:val="yellow"/>
-                      <w:lang w:val="en-US"/>
-                    </w:rPr>
-                  </w:pPr>
-                  <w:r>
-                    <w:rPr>
-                      <w:rFonts w:cs="Arial"/>
-                      <w:highlight w:val="yellow"/>
-                      <w:lang w:val="en-US"/>
-                    </w:rPr>
-                    <w:t>100</w:t>
-                  </w:r>
-                </w:p>
-              </w:tc>
-              <w:tc>
-                <w:tcPr>
-                  <w:tcW w:w="2788" w:type="dxa"/>
-                  <w:tcBorders>
-                    <w:top w:val="single" w:sz="4" w:space="0" w:color="auto"/>
-                    <w:left w:val="nil"/>
-                    <w:bottom w:val="single" w:sz="4" w:space="0" w:color="auto"/>
-                    <w:right w:val="single" w:sz="4" w:space="0" w:color="auto"/>
-                  </w:tcBorders>
-                  <w:shd w:val="clear" w:color="auto" w:fill="auto"/>
-                  <w:vAlign w:val="center"/>
-                </w:tcPr>
-                <w:p>
-                  <w:pPr>
-                    <w:rPr>
-                      <w:rFonts w:cs="Arial"/>
-                      <w:highlight w:val="yellow"/>
-                      <w:lang w:val="en-US"/>
-                    </w:rPr>
-                  </w:pPr>
-                  <w:r>
-                    <w:rPr>
-                      <w:rFonts w:cs="Arial"/>
-                      <w:highlight w:val="yellow"/>
-                      <w:lang w:val="en-US"/>
-                    </w:rPr>
-                    <w:t>Kolom alamat tidak diisi</w:t>
-                  </w:r>
                 </w:p>
               </w:tc>
             </w:tr>
@@ -2843,8 +2253,6 @@
           </w:tblBorders>
         </w:tblPrEx>
         <w:trPr>
-          <w:gridAfter w:val="1"/>
-          <w:wAfter w:w="289" w:type="dxa"/>
           <w:trHeight w:val="313"/>
         </w:trPr>
         <w:tc>
@@ -2873,13 +2281,11 @@
       </w:tr>
       <w:tr>
         <w:trPr>
-          <w:gridAfter w:val="1"/>
-          <w:wAfter w:w="151" w:type="pct"/>
           <w:trHeight w:val="218"/>
         </w:trPr>
         <w:tc>
           <w:tcPr>
-            <w:tcW w:w="2677" w:type="pct"/>
+            <w:tcW w:w="2888" w:type="pct"/>
             <w:shd w:val="clear" w:color="auto" w:fill="FFFFFF" w:themeFill="background1"/>
           </w:tcPr>
           <w:p>
@@ -2895,7 +2301,7 @@
         </w:tc>
         <w:tc>
           <w:tcPr>
-            <w:tcW w:w="2172" w:type="pct"/>
+            <w:tcW w:w="2112" w:type="pct"/>
             <w:shd w:val="clear" w:color="auto" w:fill="FFFFFF" w:themeFill="background1"/>
           </w:tcPr>
           <w:p>
@@ -2916,13 +2322,11 @@
       </w:tr>
       <w:tr>
         <w:trPr>
-          <w:gridAfter w:val="1"/>
-          <w:wAfter w:w="151" w:type="pct"/>
           <w:trHeight w:val="218"/>
         </w:trPr>
         <w:tc>
           <w:tcPr>
-            <w:tcW w:w="2677" w:type="pct"/>
+            <w:tcW w:w="2888" w:type="pct"/>
             <w:shd w:val="clear" w:color="auto" w:fill="FFFFFF" w:themeFill="background1"/>
           </w:tcPr>
           <w:p>
@@ -2936,7 +2340,7 @@
         </w:tc>
         <w:tc>
           <w:tcPr>
-            <w:tcW w:w="2172" w:type="pct"/>
+            <w:tcW w:w="2112" w:type="pct"/>
             <w:shd w:val="clear" w:color="auto" w:fill="FFFFFF" w:themeFill="background1"/>
           </w:tcPr>
           <w:p>
@@ -3019,13 +2423,11 @@
       </w:tr>
       <w:tr>
         <w:trPr>
-          <w:gridAfter w:val="1"/>
-          <w:wAfter w:w="151" w:type="pct"/>
           <w:trHeight w:val="303"/>
         </w:trPr>
         <w:tc>
           <w:tcPr>
-            <w:tcW w:w="2677" w:type="pct"/>
+            <w:tcW w:w="2888" w:type="pct"/>
             <w:shd w:val="clear" w:color="auto" w:fill="FFFFFF" w:themeFill="background1"/>
           </w:tcPr>
           <w:p>
@@ -3039,7 +2441,7 @@
         </w:tc>
         <w:tc>
           <w:tcPr>
-            <w:tcW w:w="2172" w:type="pct"/>
+            <w:tcW w:w="2112" w:type="pct"/>
             <w:shd w:val="clear" w:color="auto" w:fill="FFFFFF" w:themeFill="background1"/>
           </w:tcPr>
           <w:p>
@@ -3051,47 +2453,8 @@
                 <w:u w:val="single"/>
               </w:rPr>
             </w:pPr>
-            <w:hyperlink r:id="rId14" w:history="1">
-              <w:r>
-                <w:rPr>
-                  <w:rStyle w:val="Hyperlink"/>
-                  <w:rFonts w:cs="Arial"/>
-                  <w:noProof/>
-                  <w:color w:val="auto"/>
-                  <w:u w:val="none"/>
-                  <w:lang w:val="en-US"/>
-                </w:rPr>
-                <w:t>M</w:t>
-              </w:r>
-              <w:r>
-                <w:rPr>
-                  <w:rStyle w:val="Hyperlink"/>
-                  <w:noProof/>
-                  <w:color w:val="auto"/>
-                  <w:u w:val="none"/>
-                </w:rPr>
-                <w:t>ax</w:t>
-              </w:r>
-            </w:hyperlink>
             <w:r>
-              <w:rPr>
-                <w:rStyle w:val="Hyperlink"/>
-                <w:rFonts w:cs="Arial"/>
-                <w:noProof/>
-                <w:color w:val="auto"/>
-                <w:u w:val="none"/>
-                <w:lang w:val="en-US"/>
-              </w:rPr>
-              <w:t xml:space="preserve"> </w:t>
-            </w:r>
-            <w:r>
-              <w:rPr>
-                <w:rStyle w:val="Hyperlink"/>
-                <w:noProof/>
-                <w:color w:val="auto"/>
-                <w:u w:val="none"/>
-              </w:rPr>
-              <w:t>Darmawan</w:t>
+              <w:t>Eddy Wahyudi</w:t>
             </w:r>
           </w:p>
         </w:tc>
@@ -3125,10 +2488,10 @@
       </w:pPr>
     </w:p>
     <w:sectPr>
-      <w:headerReference w:type="default" r:id="rId15"/>
-      <w:footerReference w:type="default" r:id="rId16"/>
-      <w:headerReference w:type="first" r:id="rId17"/>
-      <w:footerReference w:type="first" r:id="rId18"/>
+      <w:headerReference w:type="default" r:id="rId13"/>
+      <w:footerReference w:type="default" r:id="rId14"/>
+      <w:headerReference w:type="first" r:id="rId15"/>
+      <w:footerReference w:type="first" r:id="rId16"/>
       <w:pgSz w:w="11906" w:h="16838"/>
       <w:pgMar w:top="1134" w:right="1134" w:bottom="1134" w:left="1418" w:header="720" w:footer="720" w:gutter="0"/>
       <w:cols w:space="0"/>
@@ -3140,7 +2503,7 @@
 </file>
 
 <file path=word/endnotes.xml><?xml version="1.0" encoding="utf-8"?>
-<w:endnotes xmlns:wpc="http://schemas.microsoft.com/office/word/2010/wordprocessingCanvas" xmlns:cx="http://schemas.microsoft.com/office/drawing/2014/chartex" xmlns:cx1="http://schemas.microsoft.com/office/drawing/2015/9/8/chartex" xmlns:cx2="http://schemas.microsoft.com/office/drawing/2015/10/21/chartex" xmlns:cx3="http://schemas.microsoft.com/office/drawing/2016/5/9/chartex" xmlns:cx4="http://schemas.microsoft.com/office/drawing/2016/5/10/chartex" xmlns:cx5="http://schemas.microsoft.com/office/drawing/2016/5/11/chartex" xmlns:cx6="http://schemas.microsoft.com/office/drawing/2016/5/12/chartex" xmlns:cx7="http://schemas.microsoft.com/office/drawing/2016/5/13/chartex" xmlns:cx8="http://schemas.microsoft.com/office/drawing/2016/5/14/chartex" xmlns:mc="http://schemas.openxmlformats.org/markup-compatibility/2006" xmlns:aink="http://schemas.microsoft.com/office/drawing/2016/ink" xmlns:am3d="http://schemas.microsoft.com/office/drawing/2017/model3d" xmlns:o="urn:schemas-microsoft-com:office:office" xmlns:r="http://schemas.openxmlformats.org/officeDocument/2006/relationships" xmlns:m="http://schemas.openxmlformats.org/officeDocument/2006/math" xmlns:v="urn:schemas-microsoft-com:vml" xmlns:wp14="http://schemas.microsoft.com/office/word/2010/wordprocessingDrawing" xmlns:wp="http://schemas.openxmlformats.org/drawingml/2006/wordprocessingDrawing" xmlns:w10="urn:schemas-microsoft-com:office:word" xmlns:w="http://schemas.openxmlformats.org/wordprocessingml/2006/main" xmlns:w14="http://schemas.microsoft.com/office/word/2010/wordml" xmlns:w15="http://schemas.microsoft.com/office/word/2012/wordml" xmlns:w16cex="http://schemas.microsoft.com/office/word/2018/wordml/cex" xmlns:w16cid="http://schemas.microsoft.com/office/word/2016/wordml/cid" xmlns:w16="http://schemas.microsoft.com/office/word/2018/wordml" xmlns:w16sdtdh="http://schemas.microsoft.com/office/word/2020/wordml/sdtdatahash" xmlns:w16se="http://schemas.microsoft.com/office/word/2015/wordml/symex" xmlns:wpg="http://schemas.microsoft.com/office/word/2010/wordprocessingGroup" xmlns:wpi="http://schemas.microsoft.com/office/word/2010/wordprocessingInk" xmlns:wne="http://schemas.microsoft.com/office/word/2006/wordml" xmlns:wps="http://schemas.microsoft.com/office/word/2010/wordprocessingShape" mc:Ignorable="w14 w15 w16se w16cid w16 w16cex w16sdtdh wp14">
+<w:endnotes xmlns:wpc="http://schemas.microsoft.com/office/word/2010/wordprocessingCanvas" xmlns:cx="http://schemas.microsoft.com/office/drawing/2014/chartex" xmlns:cx1="http://schemas.microsoft.com/office/drawing/2015/9/8/chartex" xmlns:cx2="http://schemas.microsoft.com/office/drawing/2015/10/21/chartex" xmlns:cx3="http://schemas.microsoft.com/office/drawing/2016/5/9/chartex" xmlns:cx4="http://schemas.microsoft.com/office/drawing/2016/5/10/chartex" xmlns:cx5="http://schemas.microsoft.com/office/drawing/2016/5/11/chartex" xmlns:cx6="http://schemas.microsoft.com/office/drawing/2016/5/12/chartex" xmlns:cx7="http://schemas.microsoft.com/office/drawing/2016/5/13/chartex" xmlns:cx8="http://schemas.microsoft.com/office/drawing/2016/5/14/chartex" xmlns:mc="http://schemas.openxmlformats.org/markup-compatibility/2006" xmlns:aink="http://schemas.microsoft.com/office/drawing/2016/ink" xmlns:am3d="http://schemas.microsoft.com/office/drawing/2017/model3d" xmlns:o="urn:schemas-microsoft-com:office:office" xmlns:oel="http://schemas.microsoft.com/office/2019/extlst" xmlns:r="http://schemas.openxmlformats.org/officeDocument/2006/relationships" xmlns:m="http://schemas.openxmlformats.org/officeDocument/2006/math" xmlns:v="urn:schemas-microsoft-com:vml" xmlns:wp14="http://schemas.microsoft.com/office/word/2010/wordprocessingDrawing" xmlns:wp="http://schemas.openxmlformats.org/drawingml/2006/wordprocessingDrawing" xmlns:w10="urn:schemas-microsoft-com:office:word" xmlns:w="http://schemas.openxmlformats.org/wordprocessingml/2006/main" xmlns:w14="http://schemas.microsoft.com/office/word/2010/wordml" xmlns:w15="http://schemas.microsoft.com/office/word/2012/wordml" xmlns:w16cex="http://schemas.microsoft.com/office/word/2018/wordml/cex" xmlns:w16cid="http://schemas.microsoft.com/office/word/2016/wordml/cid" xmlns:w16="http://schemas.microsoft.com/office/word/2018/wordml" xmlns:w16du="http://schemas.microsoft.com/office/word/2023/wordml/word16du" xmlns:w16sdtdh="http://schemas.microsoft.com/office/word/2020/wordml/sdtdatahash" xmlns:w16sdtfl="http://schemas.microsoft.com/office/word/2024/wordml/sdtformatlock" xmlns:w16se="http://schemas.microsoft.com/office/word/2015/wordml/symex" xmlns:wpg="http://schemas.microsoft.com/office/word/2010/wordprocessingGroup" xmlns:wpi="http://schemas.microsoft.com/office/word/2010/wordprocessingInk" xmlns:wne="http://schemas.microsoft.com/office/word/2006/wordml" xmlns:wps="http://schemas.microsoft.com/office/word/2010/wordprocessingShape" mc:Ignorable="w14 w15 w16se w16cid w16 w16cex w16sdtdh w16sdtfl w16du wp14">
   <w:endnote w:type="separator" w:id="-1">
     <w:p>
       <w:r>
@@ -3162,7 +2525,7 @@
 </file>
 
 <file path=word/footer1.xml><?xml version="1.0" encoding="utf-8"?>
-<w:ftr xmlns:wpc="http://schemas.microsoft.com/office/word/2010/wordprocessingCanvas" xmlns:cx="http://schemas.microsoft.com/office/drawing/2014/chartex" xmlns:cx1="http://schemas.microsoft.com/office/drawing/2015/9/8/chartex" xmlns:cx2="http://schemas.microsoft.com/office/drawing/2015/10/21/chartex" xmlns:cx3="http://schemas.microsoft.com/office/drawing/2016/5/9/chartex" xmlns:cx4="http://schemas.microsoft.com/office/drawing/2016/5/10/chartex" xmlns:cx5="http://schemas.microsoft.com/office/drawing/2016/5/11/chartex" xmlns:cx6="http://schemas.microsoft.com/office/drawing/2016/5/12/chartex" xmlns:cx7="http://schemas.microsoft.com/office/drawing/2016/5/13/chartex" xmlns:cx8="http://schemas.microsoft.com/office/drawing/2016/5/14/chartex" xmlns:mc="http://schemas.openxmlformats.org/markup-compatibility/2006" xmlns:aink="http://schemas.microsoft.com/office/drawing/2016/ink" xmlns:am3d="http://schemas.microsoft.com/office/drawing/2017/model3d" xmlns:o="urn:schemas-microsoft-com:office:office" xmlns:r="http://schemas.openxmlformats.org/officeDocument/2006/relationships" xmlns:m="http://schemas.openxmlformats.org/officeDocument/2006/math" xmlns:v="urn:schemas-microsoft-com:vml" xmlns:wp14="http://schemas.microsoft.com/office/word/2010/wordprocessingDrawing" xmlns:wp="http://schemas.openxmlformats.org/drawingml/2006/wordprocessingDrawing" xmlns:w10="urn:schemas-microsoft-com:office:word" xmlns:w="http://schemas.openxmlformats.org/wordprocessingml/2006/main" xmlns:w14="http://schemas.microsoft.com/office/word/2010/wordml" xmlns:w15="http://schemas.microsoft.com/office/word/2012/wordml" xmlns:w16cex="http://schemas.microsoft.com/office/word/2018/wordml/cex" xmlns:w16cid="http://schemas.microsoft.com/office/word/2016/wordml/cid" xmlns:w16="http://schemas.microsoft.com/office/word/2018/wordml" xmlns:w16sdtdh="http://schemas.microsoft.com/office/word/2020/wordml/sdtdatahash" xmlns:w16se="http://schemas.microsoft.com/office/word/2015/wordml/symex" xmlns:wpg="http://schemas.microsoft.com/office/word/2010/wordprocessingGroup" xmlns:wpi="http://schemas.microsoft.com/office/word/2010/wordprocessingInk" xmlns:wne="http://schemas.microsoft.com/office/word/2006/wordml" xmlns:wps="http://schemas.microsoft.com/office/word/2010/wordprocessingShape" mc:Ignorable="w14 w15 w16se w16cid w16 w16cex w16sdtdh wp14">
+<w:ftr xmlns:wpc="http://schemas.microsoft.com/office/word/2010/wordprocessingCanvas" xmlns:cx="http://schemas.microsoft.com/office/drawing/2014/chartex" xmlns:cx1="http://schemas.microsoft.com/office/drawing/2015/9/8/chartex" xmlns:cx2="http://schemas.microsoft.com/office/drawing/2015/10/21/chartex" xmlns:cx3="http://schemas.microsoft.com/office/drawing/2016/5/9/chartex" xmlns:cx4="http://schemas.microsoft.com/office/drawing/2016/5/10/chartex" xmlns:cx5="http://schemas.microsoft.com/office/drawing/2016/5/11/chartex" xmlns:cx6="http://schemas.microsoft.com/office/drawing/2016/5/12/chartex" xmlns:cx7="http://schemas.microsoft.com/office/drawing/2016/5/13/chartex" xmlns:cx8="http://schemas.microsoft.com/office/drawing/2016/5/14/chartex" xmlns:mc="http://schemas.openxmlformats.org/markup-compatibility/2006" xmlns:aink="http://schemas.microsoft.com/office/drawing/2016/ink" xmlns:am3d="http://schemas.microsoft.com/office/drawing/2017/model3d" xmlns:o="urn:schemas-microsoft-com:office:office" xmlns:oel="http://schemas.microsoft.com/office/2019/extlst" xmlns:r="http://schemas.openxmlformats.org/officeDocument/2006/relationships" xmlns:m="http://schemas.openxmlformats.org/officeDocument/2006/math" xmlns:v="urn:schemas-microsoft-com:vml" xmlns:wp14="http://schemas.microsoft.com/office/word/2010/wordprocessingDrawing" xmlns:wp="http://schemas.openxmlformats.org/drawingml/2006/wordprocessingDrawing" xmlns:w10="urn:schemas-microsoft-com:office:word" xmlns:w="http://schemas.openxmlformats.org/wordprocessingml/2006/main" xmlns:w14="http://schemas.microsoft.com/office/word/2010/wordml" xmlns:w15="http://schemas.microsoft.com/office/word/2012/wordml" xmlns:w16cex="http://schemas.microsoft.com/office/word/2018/wordml/cex" xmlns:w16cid="http://schemas.microsoft.com/office/word/2016/wordml/cid" xmlns:w16="http://schemas.microsoft.com/office/word/2018/wordml" xmlns:w16du="http://schemas.microsoft.com/office/word/2023/wordml/word16du" xmlns:w16sdtdh="http://schemas.microsoft.com/office/word/2020/wordml/sdtdatahash" xmlns:w16sdtfl="http://schemas.microsoft.com/office/word/2024/wordml/sdtformatlock" xmlns:w16se="http://schemas.microsoft.com/office/word/2015/wordml/symex" xmlns:wpg="http://schemas.microsoft.com/office/word/2010/wordprocessingGroup" xmlns:wpi="http://schemas.microsoft.com/office/word/2010/wordprocessingInk" xmlns:wne="http://schemas.microsoft.com/office/word/2006/wordml" xmlns:wps="http://schemas.microsoft.com/office/word/2010/wordprocessingShape" mc:Ignorable="w14 w15 w16se w16cid w16 w16cex w16sdtdh w16sdtfl w16du wp14">
   <w:tbl>
     <w:tblPr>
       <w:tblW w:w="0" w:type="auto"/>
@@ -3223,7 +2586,7 @@
 </file>
 
 <file path=word/footer2.xml><?xml version="1.0" encoding="utf-8"?>
-<w:ftr xmlns:wpc="http://schemas.microsoft.com/office/word/2010/wordprocessingCanvas" xmlns:cx="http://schemas.microsoft.com/office/drawing/2014/chartex" xmlns:cx1="http://schemas.microsoft.com/office/drawing/2015/9/8/chartex" xmlns:cx2="http://schemas.microsoft.com/office/drawing/2015/10/21/chartex" xmlns:cx3="http://schemas.microsoft.com/office/drawing/2016/5/9/chartex" xmlns:cx4="http://schemas.microsoft.com/office/drawing/2016/5/10/chartex" xmlns:cx5="http://schemas.microsoft.com/office/drawing/2016/5/11/chartex" xmlns:cx6="http://schemas.microsoft.com/office/drawing/2016/5/12/chartex" xmlns:cx7="http://schemas.microsoft.com/office/drawing/2016/5/13/chartex" xmlns:cx8="http://schemas.microsoft.com/office/drawing/2016/5/14/chartex" xmlns:mc="http://schemas.openxmlformats.org/markup-compatibility/2006" xmlns:aink="http://schemas.microsoft.com/office/drawing/2016/ink" xmlns:am3d="http://schemas.microsoft.com/office/drawing/2017/model3d" xmlns:o="urn:schemas-microsoft-com:office:office" xmlns:r="http://schemas.openxmlformats.org/officeDocument/2006/relationships" xmlns:m="http://schemas.openxmlformats.org/officeDocument/2006/math" xmlns:v="urn:schemas-microsoft-com:vml" xmlns:wp14="http://schemas.microsoft.com/office/word/2010/wordprocessingDrawing" xmlns:wp="http://schemas.openxmlformats.org/drawingml/2006/wordprocessingDrawing" xmlns:w10="urn:schemas-microsoft-com:office:word" xmlns:w="http://schemas.openxmlformats.org/wordprocessingml/2006/main" xmlns:w14="http://schemas.microsoft.com/office/word/2010/wordml" xmlns:w15="http://schemas.microsoft.com/office/word/2012/wordml" xmlns:w16cex="http://schemas.microsoft.com/office/word/2018/wordml/cex" xmlns:w16cid="http://schemas.microsoft.com/office/word/2016/wordml/cid" xmlns:w16="http://schemas.microsoft.com/office/word/2018/wordml" xmlns:w16sdtdh="http://schemas.microsoft.com/office/word/2020/wordml/sdtdatahash" xmlns:w16se="http://schemas.microsoft.com/office/word/2015/wordml/symex" xmlns:wpg="http://schemas.microsoft.com/office/word/2010/wordprocessingGroup" xmlns:wpi="http://schemas.microsoft.com/office/word/2010/wordprocessingInk" xmlns:wne="http://schemas.microsoft.com/office/word/2006/wordml" xmlns:wps="http://schemas.microsoft.com/office/word/2010/wordprocessingShape" mc:Ignorable="w14 w15 w16se w16cid w16 w16cex w16sdtdh wp14">
+<w:ftr xmlns:wpc="http://schemas.microsoft.com/office/word/2010/wordprocessingCanvas" xmlns:cx="http://schemas.microsoft.com/office/drawing/2014/chartex" xmlns:cx1="http://schemas.microsoft.com/office/drawing/2015/9/8/chartex" xmlns:cx2="http://schemas.microsoft.com/office/drawing/2015/10/21/chartex" xmlns:cx3="http://schemas.microsoft.com/office/drawing/2016/5/9/chartex" xmlns:cx4="http://schemas.microsoft.com/office/drawing/2016/5/10/chartex" xmlns:cx5="http://schemas.microsoft.com/office/drawing/2016/5/11/chartex" xmlns:cx6="http://schemas.microsoft.com/office/drawing/2016/5/12/chartex" xmlns:cx7="http://schemas.microsoft.com/office/drawing/2016/5/13/chartex" xmlns:cx8="http://schemas.microsoft.com/office/drawing/2016/5/14/chartex" xmlns:mc="http://schemas.openxmlformats.org/markup-compatibility/2006" xmlns:aink="http://schemas.microsoft.com/office/drawing/2016/ink" xmlns:am3d="http://schemas.microsoft.com/office/drawing/2017/model3d" xmlns:o="urn:schemas-microsoft-com:office:office" xmlns:oel="http://schemas.microsoft.com/office/2019/extlst" xmlns:r="http://schemas.openxmlformats.org/officeDocument/2006/relationships" xmlns:m="http://schemas.openxmlformats.org/officeDocument/2006/math" xmlns:v="urn:schemas-microsoft-com:vml" xmlns:wp14="http://schemas.microsoft.com/office/word/2010/wordprocessingDrawing" xmlns:wp="http://schemas.openxmlformats.org/drawingml/2006/wordprocessingDrawing" xmlns:w10="urn:schemas-microsoft-com:office:word" xmlns:w="http://schemas.openxmlformats.org/wordprocessingml/2006/main" xmlns:w14="http://schemas.microsoft.com/office/word/2010/wordml" xmlns:w15="http://schemas.microsoft.com/office/word/2012/wordml" xmlns:w16cex="http://schemas.microsoft.com/office/word/2018/wordml/cex" xmlns:w16cid="http://schemas.microsoft.com/office/word/2016/wordml/cid" xmlns:w16="http://schemas.microsoft.com/office/word/2018/wordml" xmlns:w16du="http://schemas.microsoft.com/office/word/2023/wordml/word16du" xmlns:w16sdtdh="http://schemas.microsoft.com/office/word/2020/wordml/sdtdatahash" xmlns:w16sdtfl="http://schemas.microsoft.com/office/word/2024/wordml/sdtformatlock" xmlns:w16se="http://schemas.microsoft.com/office/word/2015/wordml/symex" xmlns:wpg="http://schemas.microsoft.com/office/word/2010/wordprocessingGroup" xmlns:wpi="http://schemas.microsoft.com/office/word/2010/wordprocessingInk" xmlns:wne="http://schemas.microsoft.com/office/word/2006/wordml" xmlns:wps="http://schemas.microsoft.com/office/word/2010/wordprocessingShape" mc:Ignorable="w14 w15 w16se w16cid w16 w16cex w16sdtdh w16sdtfl w16du wp14">
   <w:tbl>
     <w:tblPr>
       <w:tblW w:w="0" w:type="auto"/>
@@ -3284,7 +2647,7 @@
 </file>
 
 <file path=word/footnotes.xml><?xml version="1.0" encoding="utf-8"?>
-<w:footnotes xmlns:wpc="http://schemas.microsoft.com/office/word/2010/wordprocessingCanvas" xmlns:cx="http://schemas.microsoft.com/office/drawing/2014/chartex" xmlns:cx1="http://schemas.microsoft.com/office/drawing/2015/9/8/chartex" xmlns:cx2="http://schemas.microsoft.com/office/drawing/2015/10/21/chartex" xmlns:cx3="http://schemas.microsoft.com/office/drawing/2016/5/9/chartex" xmlns:cx4="http://schemas.microsoft.com/office/drawing/2016/5/10/chartex" xmlns:cx5="http://schemas.microsoft.com/office/drawing/2016/5/11/chartex" xmlns:cx6="http://schemas.microsoft.com/office/drawing/2016/5/12/chartex" xmlns:cx7="http://schemas.microsoft.com/office/drawing/2016/5/13/chartex" xmlns:cx8="http://schemas.microsoft.com/office/drawing/2016/5/14/chartex" xmlns:mc="http://schemas.openxmlformats.org/markup-compatibility/2006" xmlns:aink="http://schemas.microsoft.com/office/drawing/2016/ink" xmlns:am3d="http://schemas.microsoft.com/office/drawing/2017/model3d" xmlns:o="urn:schemas-microsoft-com:office:office" xmlns:r="http://schemas.openxmlformats.org/officeDocument/2006/relationships" xmlns:m="http://schemas.openxmlformats.org/officeDocument/2006/math" xmlns:v="urn:schemas-microsoft-com:vml" xmlns:wp14="http://schemas.microsoft.com/office/word/2010/wordprocessingDrawing" xmlns:wp="http://schemas.openxmlformats.org/drawingml/2006/wordprocessingDrawing" xmlns:w10="urn:schemas-microsoft-com:office:word" xmlns:w="http://schemas.openxmlformats.org/wordprocessingml/2006/main" xmlns:w14="http://schemas.microsoft.com/office/word/2010/wordml" xmlns:w15="http://schemas.microsoft.com/office/word/2012/wordml" xmlns:w16cex="http://schemas.microsoft.com/office/word/2018/wordml/cex" xmlns:w16cid="http://schemas.microsoft.com/office/word/2016/wordml/cid" xmlns:w16="http://schemas.microsoft.com/office/word/2018/wordml" xmlns:w16sdtdh="http://schemas.microsoft.com/office/word/2020/wordml/sdtdatahash" xmlns:w16se="http://schemas.microsoft.com/office/word/2015/wordml/symex" xmlns:wpg="http://schemas.microsoft.com/office/word/2010/wordprocessingGroup" xmlns:wpi="http://schemas.microsoft.com/office/word/2010/wordprocessingInk" xmlns:wne="http://schemas.microsoft.com/office/word/2006/wordml" xmlns:wps="http://schemas.microsoft.com/office/word/2010/wordprocessingShape" mc:Ignorable="w14 w15 w16se w16cid w16 w16cex w16sdtdh wp14">
+<w:footnotes xmlns:wpc="http://schemas.microsoft.com/office/word/2010/wordprocessingCanvas" xmlns:cx="http://schemas.microsoft.com/office/drawing/2014/chartex" xmlns:cx1="http://schemas.microsoft.com/office/drawing/2015/9/8/chartex" xmlns:cx2="http://schemas.microsoft.com/office/drawing/2015/10/21/chartex" xmlns:cx3="http://schemas.microsoft.com/office/drawing/2016/5/9/chartex" xmlns:cx4="http://schemas.microsoft.com/office/drawing/2016/5/10/chartex" xmlns:cx5="http://schemas.microsoft.com/office/drawing/2016/5/11/chartex" xmlns:cx6="http://schemas.microsoft.com/office/drawing/2016/5/12/chartex" xmlns:cx7="http://schemas.microsoft.com/office/drawing/2016/5/13/chartex" xmlns:cx8="http://schemas.microsoft.com/office/drawing/2016/5/14/chartex" xmlns:mc="http://schemas.openxmlformats.org/markup-compatibility/2006" xmlns:aink="http://schemas.microsoft.com/office/drawing/2016/ink" xmlns:am3d="http://schemas.microsoft.com/office/drawing/2017/model3d" xmlns:o="urn:schemas-microsoft-com:office:office" xmlns:oel="http://schemas.microsoft.com/office/2019/extlst" xmlns:r="http://schemas.openxmlformats.org/officeDocument/2006/relationships" xmlns:m="http://schemas.openxmlformats.org/officeDocument/2006/math" xmlns:v="urn:schemas-microsoft-com:vml" xmlns:wp14="http://schemas.microsoft.com/office/word/2010/wordprocessingDrawing" xmlns:wp="http://schemas.openxmlformats.org/drawingml/2006/wordprocessingDrawing" xmlns:w10="urn:schemas-microsoft-com:office:word" xmlns:w="http://schemas.openxmlformats.org/wordprocessingml/2006/main" xmlns:w14="http://schemas.microsoft.com/office/word/2010/wordml" xmlns:w15="http://schemas.microsoft.com/office/word/2012/wordml" xmlns:w16cex="http://schemas.microsoft.com/office/word/2018/wordml/cex" xmlns:w16cid="http://schemas.microsoft.com/office/word/2016/wordml/cid" xmlns:w16="http://schemas.microsoft.com/office/word/2018/wordml" xmlns:w16du="http://schemas.microsoft.com/office/word/2023/wordml/word16du" xmlns:w16sdtdh="http://schemas.microsoft.com/office/word/2020/wordml/sdtdatahash" xmlns:w16sdtfl="http://schemas.microsoft.com/office/word/2024/wordml/sdtformatlock" xmlns:w16se="http://schemas.microsoft.com/office/word/2015/wordml/symex" xmlns:wpg="http://schemas.microsoft.com/office/word/2010/wordprocessingGroup" xmlns:wpi="http://schemas.microsoft.com/office/word/2010/wordprocessingInk" xmlns:wne="http://schemas.microsoft.com/office/word/2006/wordml" xmlns:wps="http://schemas.microsoft.com/office/word/2010/wordprocessingShape" mc:Ignorable="w14 w15 w16se w16cid w16 w16cex w16sdtdh w16sdtfl w16du wp14">
   <w:footnote w:type="separator" w:id="-1">
     <w:p>
       <w:r>
@@ -3306,7 +2669,7 @@
 </file>
 
 <file path=word/header1.xml><?xml version="1.0" encoding="utf-8"?>
-<w:hdr xmlns:wpc="http://schemas.microsoft.com/office/word/2010/wordprocessingCanvas" xmlns:cx="http://schemas.microsoft.com/office/drawing/2014/chartex" xmlns:cx1="http://schemas.microsoft.com/office/drawing/2015/9/8/chartex" xmlns:cx2="http://schemas.microsoft.com/office/drawing/2015/10/21/chartex" xmlns:cx3="http://schemas.microsoft.com/office/drawing/2016/5/9/chartex" xmlns:cx4="http://schemas.microsoft.com/office/drawing/2016/5/10/chartex" xmlns:cx5="http://schemas.microsoft.com/office/drawing/2016/5/11/chartex" xmlns:cx6="http://schemas.microsoft.com/office/drawing/2016/5/12/chartex" xmlns:cx7="http://schemas.microsoft.com/office/drawing/2016/5/13/chartex" xmlns:cx8="http://schemas.microsoft.com/office/drawing/2016/5/14/chartex" xmlns:mc="http://schemas.openxmlformats.org/markup-compatibility/2006" xmlns:aink="http://schemas.microsoft.com/office/drawing/2016/ink" xmlns:am3d="http://schemas.microsoft.com/office/drawing/2017/model3d" xmlns:o="urn:schemas-microsoft-com:office:office" xmlns:r="http://schemas.openxmlformats.org/officeDocument/2006/relationships" xmlns:m="http://schemas.openxmlformats.org/officeDocument/2006/math" xmlns:v="urn:schemas-microsoft-com:vml" xmlns:wp14="http://schemas.microsoft.com/office/word/2010/wordprocessingDrawing" xmlns:wp="http://schemas.openxmlformats.org/drawingml/2006/wordprocessingDrawing" xmlns:w10="urn:schemas-microsoft-com:office:word" xmlns:w="http://schemas.openxmlformats.org/wordprocessingml/2006/main" xmlns:w14="http://schemas.microsoft.com/office/word/2010/wordml" xmlns:w15="http://schemas.microsoft.com/office/word/2012/wordml" xmlns:w16cex="http://schemas.microsoft.com/office/word/2018/wordml/cex" xmlns:w16cid="http://schemas.microsoft.com/office/word/2016/wordml/cid" xmlns:w16="http://schemas.microsoft.com/office/word/2018/wordml" xmlns:w16sdtdh="http://schemas.microsoft.com/office/word/2020/wordml/sdtdatahash" xmlns:w16se="http://schemas.microsoft.com/office/word/2015/wordml/symex" xmlns:wpg="http://schemas.microsoft.com/office/word/2010/wordprocessingGroup" xmlns:wpi="http://schemas.microsoft.com/office/word/2010/wordprocessingInk" xmlns:wne="http://schemas.microsoft.com/office/word/2006/wordml" xmlns:wps="http://schemas.microsoft.com/office/word/2010/wordprocessingShape" mc:Ignorable="w14 w15 w16se w16cid w16 w16cex w16sdtdh wp14">
+<w:hdr xmlns:wpc="http://schemas.microsoft.com/office/word/2010/wordprocessingCanvas" xmlns:cx="http://schemas.microsoft.com/office/drawing/2014/chartex" xmlns:cx1="http://schemas.microsoft.com/office/drawing/2015/9/8/chartex" xmlns:cx2="http://schemas.microsoft.com/office/drawing/2015/10/21/chartex" xmlns:cx3="http://schemas.microsoft.com/office/drawing/2016/5/9/chartex" xmlns:cx4="http://schemas.microsoft.com/office/drawing/2016/5/10/chartex" xmlns:cx5="http://schemas.microsoft.com/office/drawing/2016/5/11/chartex" xmlns:cx6="http://schemas.microsoft.com/office/drawing/2016/5/12/chartex" xmlns:cx7="http://schemas.microsoft.com/office/drawing/2016/5/13/chartex" xmlns:cx8="http://schemas.microsoft.com/office/drawing/2016/5/14/chartex" xmlns:mc="http://schemas.openxmlformats.org/markup-compatibility/2006" xmlns:aink="http://schemas.microsoft.com/office/drawing/2016/ink" xmlns:am3d="http://schemas.microsoft.com/office/drawing/2017/model3d" xmlns:o="urn:schemas-microsoft-com:office:office" xmlns:oel="http://schemas.microsoft.com/office/2019/extlst" xmlns:r="http://schemas.openxmlformats.org/officeDocument/2006/relationships" xmlns:m="http://schemas.openxmlformats.org/officeDocument/2006/math" xmlns:v="urn:schemas-microsoft-com:vml" xmlns:wp14="http://schemas.microsoft.com/office/word/2010/wordprocessingDrawing" xmlns:wp="http://schemas.openxmlformats.org/drawingml/2006/wordprocessingDrawing" xmlns:w10="urn:schemas-microsoft-com:office:word" xmlns:w="http://schemas.openxmlformats.org/wordprocessingml/2006/main" xmlns:w14="http://schemas.microsoft.com/office/word/2010/wordml" xmlns:w15="http://schemas.microsoft.com/office/word/2012/wordml" xmlns:w16cex="http://schemas.microsoft.com/office/word/2018/wordml/cex" xmlns:w16cid="http://schemas.microsoft.com/office/word/2016/wordml/cid" xmlns:w16="http://schemas.microsoft.com/office/word/2018/wordml" xmlns:w16du="http://schemas.microsoft.com/office/word/2023/wordml/word16du" xmlns:w16sdtdh="http://schemas.microsoft.com/office/word/2020/wordml/sdtdatahash" xmlns:w16sdtfl="http://schemas.microsoft.com/office/word/2024/wordml/sdtformatlock" xmlns:w16se="http://schemas.microsoft.com/office/word/2015/wordml/symex" xmlns:wpg="http://schemas.microsoft.com/office/word/2010/wordprocessingGroup" xmlns:wpi="http://schemas.microsoft.com/office/word/2010/wordprocessingInk" xmlns:wne="http://schemas.microsoft.com/office/word/2006/wordml" xmlns:wps="http://schemas.microsoft.com/office/word/2010/wordprocessingShape" mc:Ignorable="w14 w15 w16se w16cid w16 w16cex w16sdtdh w16sdtfl w16du wp14">
   <w:tbl>
     <w:tblPr>
       <w:tblW w:w="0" w:type="auto"/>
@@ -3367,7 +2730,7 @@
 </file>
 
 <file path=word/header2.xml><?xml version="1.0" encoding="utf-8"?>
-<w:hdr xmlns:wpc="http://schemas.microsoft.com/office/word/2010/wordprocessingCanvas" xmlns:cx="http://schemas.microsoft.com/office/drawing/2014/chartex" xmlns:cx1="http://schemas.microsoft.com/office/drawing/2015/9/8/chartex" xmlns:cx2="http://schemas.microsoft.com/office/drawing/2015/10/21/chartex" xmlns:cx3="http://schemas.microsoft.com/office/drawing/2016/5/9/chartex" xmlns:cx4="http://schemas.microsoft.com/office/drawing/2016/5/10/chartex" xmlns:cx5="http://schemas.microsoft.com/office/drawing/2016/5/11/chartex" xmlns:cx6="http://schemas.microsoft.com/office/drawing/2016/5/12/chartex" xmlns:cx7="http://schemas.microsoft.com/office/drawing/2016/5/13/chartex" xmlns:cx8="http://schemas.microsoft.com/office/drawing/2016/5/14/chartex" xmlns:mc="http://schemas.openxmlformats.org/markup-compatibility/2006" xmlns:aink="http://schemas.microsoft.com/office/drawing/2016/ink" xmlns:am3d="http://schemas.microsoft.com/office/drawing/2017/model3d" xmlns:o="urn:schemas-microsoft-com:office:office" xmlns:r="http://schemas.openxmlformats.org/officeDocument/2006/relationships" xmlns:m="http://schemas.openxmlformats.org/officeDocument/2006/math" xmlns:v="urn:schemas-microsoft-com:vml" xmlns:wp14="http://schemas.microsoft.com/office/word/2010/wordprocessingDrawing" xmlns:wp="http://schemas.openxmlformats.org/drawingml/2006/wordprocessingDrawing" xmlns:w10="urn:schemas-microsoft-com:office:word" xmlns:w="http://schemas.openxmlformats.org/wordprocessingml/2006/main" xmlns:w14="http://schemas.microsoft.com/office/word/2010/wordml" xmlns:w15="http://schemas.microsoft.com/office/word/2012/wordml" xmlns:w16cex="http://schemas.microsoft.com/office/word/2018/wordml/cex" xmlns:w16cid="http://schemas.microsoft.com/office/word/2016/wordml/cid" xmlns:w16="http://schemas.microsoft.com/office/word/2018/wordml" xmlns:w16sdtdh="http://schemas.microsoft.com/office/word/2020/wordml/sdtdatahash" xmlns:w16se="http://schemas.microsoft.com/office/word/2015/wordml/symex" xmlns:wpg="http://schemas.microsoft.com/office/word/2010/wordprocessingGroup" xmlns:wpi="http://schemas.microsoft.com/office/word/2010/wordprocessingInk" xmlns:wne="http://schemas.microsoft.com/office/word/2006/wordml" xmlns:wps="http://schemas.microsoft.com/office/word/2010/wordprocessingShape" mc:Ignorable="w14 w15 w16se w16cid w16 w16cex w16sdtdh wp14">
+<w:hdr xmlns:wpc="http://schemas.microsoft.com/office/word/2010/wordprocessingCanvas" xmlns:cx="http://schemas.microsoft.com/office/drawing/2014/chartex" xmlns:cx1="http://schemas.microsoft.com/office/drawing/2015/9/8/chartex" xmlns:cx2="http://schemas.microsoft.com/office/drawing/2015/10/21/chartex" xmlns:cx3="http://schemas.microsoft.com/office/drawing/2016/5/9/chartex" xmlns:cx4="http://schemas.microsoft.com/office/drawing/2016/5/10/chartex" xmlns:cx5="http://schemas.microsoft.com/office/drawing/2016/5/11/chartex" xmlns:cx6="http://schemas.microsoft.com/office/drawing/2016/5/12/chartex" xmlns:cx7="http://schemas.microsoft.com/office/drawing/2016/5/13/chartex" xmlns:cx8="http://schemas.microsoft.com/office/drawing/2016/5/14/chartex" xmlns:mc="http://schemas.openxmlformats.org/markup-compatibility/2006" xmlns:aink="http://schemas.microsoft.com/office/drawing/2016/ink" xmlns:am3d="http://schemas.microsoft.com/office/drawing/2017/model3d" xmlns:o="urn:schemas-microsoft-com:office:office" xmlns:oel="http://schemas.microsoft.com/office/2019/extlst" xmlns:r="http://schemas.openxmlformats.org/officeDocument/2006/relationships" xmlns:m="http://schemas.openxmlformats.org/officeDocument/2006/math" xmlns:v="urn:schemas-microsoft-com:vml" xmlns:wp14="http://schemas.microsoft.com/office/word/2010/wordprocessingDrawing" xmlns:wp="http://schemas.openxmlformats.org/drawingml/2006/wordprocessingDrawing" xmlns:w10="urn:schemas-microsoft-com:office:word" xmlns:w="http://schemas.openxmlformats.org/wordprocessingml/2006/main" xmlns:w14="http://schemas.microsoft.com/office/word/2010/wordml" xmlns:w15="http://schemas.microsoft.com/office/word/2012/wordml" xmlns:w16cex="http://schemas.microsoft.com/office/word/2018/wordml/cex" xmlns:w16cid="http://schemas.microsoft.com/office/word/2016/wordml/cid" xmlns:w16="http://schemas.microsoft.com/office/word/2018/wordml" xmlns:w16du="http://schemas.microsoft.com/office/word/2023/wordml/word16du" xmlns:w16sdtdh="http://schemas.microsoft.com/office/word/2020/wordml/sdtdatahash" xmlns:w16sdtfl="http://schemas.microsoft.com/office/word/2024/wordml/sdtformatlock" xmlns:w16se="http://schemas.microsoft.com/office/word/2015/wordml/symex" xmlns:wpg="http://schemas.microsoft.com/office/word/2010/wordprocessingGroup" xmlns:wpi="http://schemas.microsoft.com/office/word/2010/wordprocessingInk" xmlns:wne="http://schemas.microsoft.com/office/word/2006/wordml" xmlns:wps="http://schemas.microsoft.com/office/word/2010/wordprocessingShape" mc:Ignorable="w14 w15 w16se w16cid w16 w16cex w16sdtdh w16sdtfl w16du wp14">
   <w:tbl>
     <w:tblPr>
       <w:tblW w:w="9640" w:type="dxa"/>
@@ -3596,7 +2959,7 @@
 </file>
 
 <file path=word/numbering.xml><?xml version="1.0" encoding="utf-8"?>
-<w:numbering xmlns:wpc="http://schemas.microsoft.com/office/word/2010/wordprocessingCanvas" xmlns:cx="http://schemas.microsoft.com/office/drawing/2014/chartex" xmlns:cx1="http://schemas.microsoft.com/office/drawing/2015/9/8/chartex" xmlns:cx2="http://schemas.microsoft.com/office/drawing/2015/10/21/chartex" xmlns:cx3="http://schemas.microsoft.com/office/drawing/2016/5/9/chartex" xmlns:cx4="http://schemas.microsoft.com/office/drawing/2016/5/10/chartex" xmlns:cx5="http://schemas.microsoft.com/office/drawing/2016/5/11/chartex" xmlns:cx6="http://schemas.microsoft.com/office/drawing/2016/5/12/chartex" xmlns:cx7="http://schemas.microsoft.com/office/drawing/2016/5/13/chartex" xmlns:cx8="http://schemas.microsoft.com/office/drawing/2016/5/14/chartex" xmlns:mc="http://schemas.openxmlformats.org/markup-compatibility/2006" xmlns:aink="http://schemas.microsoft.com/office/drawing/2016/ink" xmlns:am3d="http://schemas.microsoft.com/office/drawing/2017/model3d" xmlns:o="urn:schemas-microsoft-com:office:office" xmlns:r="http://schemas.openxmlformats.org/officeDocument/2006/relationships" xmlns:m="http://schemas.openxmlformats.org/officeDocument/2006/math" xmlns:v="urn:schemas-microsoft-com:vml" xmlns:wp14="http://schemas.microsoft.com/office/word/2010/wordprocessingDrawing" xmlns:wp="http://schemas.openxmlformats.org/drawingml/2006/wordprocessingDrawing" xmlns:w10="urn:schemas-microsoft-com:office:word" xmlns:w="http://schemas.openxmlformats.org/wordprocessingml/2006/main" xmlns:w14="http://schemas.microsoft.com/office/word/2010/wordml" xmlns:w15="http://schemas.microsoft.com/office/word/2012/wordml" xmlns:w16cex="http://schemas.microsoft.com/office/word/2018/wordml/cex" xmlns:w16cid="http://schemas.microsoft.com/office/word/2016/wordml/cid" xmlns:w16="http://schemas.microsoft.com/office/word/2018/wordml" xmlns:w16sdtdh="http://schemas.microsoft.com/office/word/2020/wordml/sdtdatahash" xmlns:w16se="http://schemas.microsoft.com/office/word/2015/wordml/symex" xmlns:wpg="http://schemas.microsoft.com/office/word/2010/wordprocessingGroup" xmlns:wpi="http://schemas.microsoft.com/office/word/2010/wordprocessingInk" xmlns:wne="http://schemas.microsoft.com/office/word/2006/wordml" xmlns:wps="http://schemas.microsoft.com/office/word/2010/wordprocessingShape" mc:Ignorable="w14 w15 w16se w16cid w16 w16cex w16sdtdh wp14">
+<w:numbering xmlns:wpc="http://schemas.microsoft.com/office/word/2010/wordprocessingCanvas" xmlns:cx="http://schemas.microsoft.com/office/drawing/2014/chartex" xmlns:cx1="http://schemas.microsoft.com/office/drawing/2015/9/8/chartex" xmlns:cx2="http://schemas.microsoft.com/office/drawing/2015/10/21/chartex" xmlns:cx3="http://schemas.microsoft.com/office/drawing/2016/5/9/chartex" xmlns:cx4="http://schemas.microsoft.com/office/drawing/2016/5/10/chartex" xmlns:cx5="http://schemas.microsoft.com/office/drawing/2016/5/11/chartex" xmlns:cx6="http://schemas.microsoft.com/office/drawing/2016/5/12/chartex" xmlns:cx7="http://schemas.microsoft.com/office/drawing/2016/5/13/chartex" xmlns:cx8="http://schemas.microsoft.com/office/drawing/2016/5/14/chartex" xmlns:mc="http://schemas.openxmlformats.org/markup-compatibility/2006" xmlns:aink="http://schemas.microsoft.com/office/drawing/2016/ink" xmlns:am3d="http://schemas.microsoft.com/office/drawing/2017/model3d" xmlns:o="urn:schemas-microsoft-com:office:office" xmlns:oel="http://schemas.microsoft.com/office/2019/extlst" xmlns:r="http://schemas.openxmlformats.org/officeDocument/2006/relationships" xmlns:m="http://schemas.openxmlformats.org/officeDocument/2006/math" xmlns:v="urn:schemas-microsoft-com:vml" xmlns:wp14="http://schemas.microsoft.com/office/word/2010/wordprocessingDrawing" xmlns:wp="http://schemas.openxmlformats.org/drawingml/2006/wordprocessingDrawing" xmlns:w10="urn:schemas-microsoft-com:office:word" xmlns:w="http://schemas.openxmlformats.org/wordprocessingml/2006/main" xmlns:w14="http://schemas.microsoft.com/office/word/2010/wordml" xmlns:w15="http://schemas.microsoft.com/office/word/2012/wordml" xmlns:w16cex="http://schemas.microsoft.com/office/word/2018/wordml/cex" xmlns:w16cid="http://schemas.microsoft.com/office/word/2016/wordml/cid" xmlns:w16="http://schemas.microsoft.com/office/word/2018/wordml" xmlns:w16du="http://schemas.microsoft.com/office/word/2023/wordml/word16du" xmlns:w16sdtdh="http://schemas.microsoft.com/office/word/2020/wordml/sdtdatahash" xmlns:w16sdtfl="http://schemas.microsoft.com/office/word/2024/wordml/sdtformatlock" xmlns:w16se="http://schemas.microsoft.com/office/word/2015/wordml/symex" xmlns:wpg="http://schemas.microsoft.com/office/word/2010/wordprocessingGroup" xmlns:wpi="http://schemas.microsoft.com/office/word/2010/wordprocessingInk" xmlns:wne="http://schemas.microsoft.com/office/word/2006/wordml" xmlns:wps="http://schemas.microsoft.com/office/word/2010/wordprocessingShape" mc:Ignorable="w14 w15 w16se w16cid w16 w16cex w16sdtdh w16sdtfl w16du wp14">
   <w:abstractNum w:abstractNumId="0" w15:restartNumberingAfterBreak="0">
     <w:nsid w:val="209C3117"/>
     <w:multiLevelType w:val="hybridMultilevel"/>
@@ -3941,23 +3304,23 @@
       </w:pPr>
     </w:lvl>
   </w:abstractNum>
-  <w:num w:numId="1">
+  <w:num w:numId="1" w16cid:durableId="392969812">
     <w:abstractNumId w:val="3"/>
   </w:num>
-  <w:num w:numId="2">
+  <w:num w:numId="2" w16cid:durableId="848133777">
     <w:abstractNumId w:val="2"/>
   </w:num>
-  <w:num w:numId="3">
+  <w:num w:numId="3" w16cid:durableId="1590962770">
     <w:abstractNumId w:val="1"/>
   </w:num>
-  <w:num w:numId="4">
+  <w:num w:numId="4" w16cid:durableId="2123263908">
     <w:abstractNumId w:val="0"/>
   </w:num>
 </w:numbering>
 </file>
 
 <file path=word/styles.xml><?xml version="1.0" encoding="utf-8"?>
-<w:styles xmlns:mc="http://schemas.openxmlformats.org/markup-compatibility/2006" xmlns:r="http://schemas.openxmlformats.org/officeDocument/2006/relationships" xmlns:w="http://schemas.openxmlformats.org/wordprocessingml/2006/main" xmlns:w14="http://schemas.microsoft.com/office/word/2010/wordml" xmlns:w15="http://schemas.microsoft.com/office/word/2012/wordml" xmlns:w16cex="http://schemas.microsoft.com/office/word/2018/wordml/cex" xmlns:w16cid="http://schemas.microsoft.com/office/word/2016/wordml/cid" xmlns:w16="http://schemas.microsoft.com/office/word/2018/wordml" xmlns:w16sdtdh="http://schemas.microsoft.com/office/word/2020/wordml/sdtdatahash" xmlns:w16se="http://schemas.microsoft.com/office/word/2015/wordml/symex" mc:Ignorable="w14 w15 w16se w16cid w16 w16cex w16sdtdh">
+<w:styles xmlns:mc="http://schemas.openxmlformats.org/markup-compatibility/2006" xmlns:r="http://schemas.openxmlformats.org/officeDocument/2006/relationships" xmlns:w="http://schemas.openxmlformats.org/wordprocessingml/2006/main" xmlns:w14="http://schemas.microsoft.com/office/word/2010/wordml" xmlns:w15="http://schemas.microsoft.com/office/word/2012/wordml" xmlns:w16cex="http://schemas.microsoft.com/office/word/2018/wordml/cex" xmlns:w16cid="http://schemas.microsoft.com/office/word/2016/wordml/cid" xmlns:w16="http://schemas.microsoft.com/office/word/2018/wordml" xmlns:w16du="http://schemas.microsoft.com/office/word/2023/wordml/word16du" xmlns:w16sdtdh="http://schemas.microsoft.com/office/word/2020/wordml/sdtdatahash" xmlns:w16sdtfl="http://schemas.microsoft.com/office/word/2024/wordml/sdtformatlock" xmlns:w16se="http://schemas.microsoft.com/office/word/2015/wordml/symex" mc:Ignorable="w14 w15 w16se w16cid w16 w16cex w16sdtdh w16sdtfl w16du">
   <w:docDefaults>
     <w:rPrDefault>
       <w:rPr>
@@ -5019,26 +4382,6 @@
 </file>
 
 <file path=customXml/item1.xml><?xml version="1.0" encoding="utf-8"?>
-<?mso-contentType ?>
-<FormTemplates xmlns="http://schemas.microsoft.com/sharepoint/v3/contenttype/forms">
-  <Display>DocumentLibraryForm</Display>
-  <Edit>DocumentLibraryForm</Edit>
-  <New>DocumentLibraryForm</New>
-</FormTemplates>
-</file>
-
-<file path=customXml/item2.xml><?xml version="1.0" encoding="utf-8"?>
-<p:properties xmlns:p="http://schemas.microsoft.com/office/2006/metadata/properties" xmlns:xsi="http://www.w3.org/2001/XMLSchema-instance" xmlns:pc="http://schemas.microsoft.com/office/infopath/2007/PartnerControls">
-  <documentManagement>
-    <TaxCatchAll xmlns="6a3343e3-a342-4977-82e8-547b9d40dd28" xsi:nil="true"/>
-    <lcf76f155ced4ddcb4097134ff3c332f xmlns="122b6bc9-85c8-4cf1-91e6-8e70987f848c">
-      <Terms xmlns="http://schemas.microsoft.com/office/infopath/2007/PartnerControls"/>
-    </lcf76f155ced4ddcb4097134ff3c332f>
-  </documentManagement>
-</p:properties>
-</file>
-
-<file path=customXml/item3.xml><?xml version="1.0" encoding="utf-8"?>
 <ct:contentTypeSchema xmlns:ct="http://schemas.microsoft.com/office/2006/metadata/contentType" xmlns:ma="http://schemas.microsoft.com/office/2006/metadata/properties/metaAttributes" ct:_="" ma:_="" ma:contentTypeName="Document" ma:contentTypeID="0x010100DAB4865CE0063E4C863866F234696B4D" ma:contentTypeVersion="11" ma:contentTypeDescription="Create a new document." ma:contentTypeScope="" ma:versionID="dc68f9ba90de6bdc71dcd44eaa64d902">
   <xsd:schema xmlns:xsd="http://www.w3.org/2001/XMLSchema" xmlns:xs="http://www.w3.org/2001/XMLSchema" xmlns:p="http://schemas.microsoft.com/office/2006/metadata/properties" xmlns:ns2="122b6bc9-85c8-4cf1-91e6-8e70987f848c" xmlns:ns3="6a3343e3-a342-4977-82e8-547b9d40dd28" targetNamespace="http://schemas.microsoft.com/office/2006/metadata/properties" ma:root="true" ma:fieldsID="14f7a31914c7b408390499466c8b176f" ns2:_="" ns3:_="">
     <xsd:import namespace="122b6bc9-85c8-4cf1-91e6-8e70987f848c"/>
@@ -5233,10 +4576,41 @@
 </ct:contentTypeSchema>
 </file>
 
+<file path=customXml/item2.xml><?xml version="1.0" encoding="utf-8"?>
+<p:properties xmlns:p="http://schemas.microsoft.com/office/2006/metadata/properties" xmlns:xsi="http://www.w3.org/2001/XMLSchema-instance" xmlns:pc="http://schemas.microsoft.com/office/infopath/2007/PartnerControls">
+  <documentManagement>
+    <TaxCatchAll xmlns="6a3343e3-a342-4977-82e8-547b9d40dd28" xsi:nil="true"/>
+    <lcf76f155ced4ddcb4097134ff3c332f xmlns="122b6bc9-85c8-4cf1-91e6-8e70987f848c">
+      <Terms xmlns="http://schemas.microsoft.com/office/infopath/2007/PartnerControls"/>
+    </lcf76f155ced4ddcb4097134ff3c332f>
+  </documentManagement>
+</p:properties>
+</file>
+
+<file path=customXml/item3.xml><?xml version="1.0" encoding="utf-8"?>
+<?mso-contentType ?>
+<FormTemplates xmlns="http://schemas.microsoft.com/sharepoint/v3/contenttype/forms">
+  <Display>DocumentLibraryForm</Display>
+  <Edit>DocumentLibraryForm</Edit>
+  <New>DocumentLibraryForm</New>
+</FormTemplates>
+</file>
+
 <file path=customXml/itemProps1.xml><?xml version="1.0" encoding="utf-8"?>
-<ds:datastoreItem xmlns:ds="http://schemas.openxmlformats.org/officeDocument/2006/customXml" ds:itemID="{016BB153-861F-4192-A688-0C944E34872E}">
+<ds:datastoreItem xmlns:ds="http://schemas.openxmlformats.org/officeDocument/2006/customXml" ds:itemID="{4D2E664C-9446-4AF3-8769-3CCB10B810F7}">
   <ds:schemaRefs>
-    <ds:schemaRef ds:uri="http://schemas.microsoft.com/sharepoint/v3/contenttype/forms"/>
+    <ds:schemaRef ds:uri="http://schemas.microsoft.com/office/2006/metadata/contentType"/>
+    <ds:schemaRef ds:uri="http://schemas.microsoft.com/office/2006/metadata/properties/metaAttributes"/>
+    <ds:schemaRef ds:uri="http://www.w3.org/2001/XMLSchema"/>
+    <ds:schemaRef ds:uri="http://schemas.microsoft.com/office/2006/metadata/properties"/>
+    <ds:schemaRef ds:uri="122b6bc9-85c8-4cf1-91e6-8e70987f848c"/>
+    <ds:schemaRef ds:uri="6a3343e3-a342-4977-82e8-547b9d40dd28"/>
+    <ds:schemaRef ds:uri="http://schemas.microsoft.com/office/2006/documentManagement/types"/>
+    <ds:schemaRef ds:uri="http://schemas.microsoft.com/office/infopath/2007/PartnerControls"/>
+    <ds:schemaRef ds:uri="http://schemas.openxmlformats.org/package/2006/metadata/core-properties"/>
+    <ds:schemaRef ds:uri="http://purl.org/dc/elements/1.1/"/>
+    <ds:schemaRef ds:uri="http://purl.org/dc/terms/"/>
+    <ds:schemaRef ds:uri="http://schemas.microsoft.com/internal/obd"/>
   </ds:schemaRefs>
 </ds:datastoreItem>
 </file>
@@ -5246,12 +4620,16 @@
   <ds:schemaRefs>
     <ds:schemaRef ds:uri="http://schemas.microsoft.com/office/2006/metadata/properties"/>
     <ds:schemaRef ds:uri="http://schemas.microsoft.com/office/infopath/2007/PartnerControls"/>
-    <ds:schemaRef ds:uri="0ef7128f-a7d0-43d2-bee4-5f56f49c64da"/>
-    <ds:schemaRef ds:uri="6d95bc28-2e5c-4ccd-92aa-ea746d833732"/>
+    <ds:schemaRef ds:uri="6a3343e3-a342-4977-82e8-547b9d40dd28"/>
+    <ds:schemaRef ds:uri="122b6bc9-85c8-4cf1-91e6-8e70987f848c"/>
   </ds:schemaRefs>
 </ds:datastoreItem>
 </file>
 
 <file path=customXml/itemProps3.xml><?xml version="1.0" encoding="utf-8"?>
-<ds:datastoreItem xmlns:ds="http://schemas.openxmlformats.org/officeDocument/2006/customXml" ds:itemID="{4D2E664C-9446-4AF3-8769-3CCB10B810F7}"/>
+<ds:datastoreItem xmlns:ds="http://schemas.openxmlformats.org/officeDocument/2006/customXml" ds:itemID="{016BB153-861F-4192-A688-0C944E34872E}">
+  <ds:schemaRefs>
+    <ds:schemaRef ds:uri="http://schemas.microsoft.com/sharepoint/v3/contenttype/forms"/>
+  </ds:schemaRefs>
+</ds:datastoreItem>
 </file>
</xml_diff>

<commit_message>
Correct spelling in multiple document templates
</commit_message>
<xml_diff>
--- a/diamond_web/fixtures/default_templates/surat_klarifikasi.docx
+++ b/diamond_web/fixtures/default_templates/surat_klarifikasi.docx
@@ -1373,7 +1373,13 @@
               </w:rPr>
             </w:pPr>
             <w:r>
-              <w:t>Eddy Wahyudi</w:t>
+              <w:t>Edd</w:t>
+            </w:r>
+            <w:r>
+              <w:t>i</w:t>
+            </w:r>
+            <w:r>
+              <w:t xml:space="preserve"> Wahyudi</w:t>
             </w:r>
           </w:p>
         </w:tc>
@@ -2454,7 +2460,13 @@
               </w:rPr>
             </w:pPr>
             <w:r>
-              <w:t>Eddy Wahyudi</w:t>
+              <w:t>Edd</w:t>
+            </w:r>
+            <w:r>
+              <w:t>i</w:t>
+            </w:r>
+            <w:r>
+              <w:t xml:space="preserve"> Wahyudi</w:t>
             </w:r>
           </w:p>
         </w:tc>
@@ -4382,6 +4394,17 @@
 </file>
 
 <file path=customXml/item1.xml><?xml version="1.0" encoding="utf-8"?>
+<p:properties xmlns:p="http://schemas.microsoft.com/office/2006/metadata/properties" xmlns:xsi="http://www.w3.org/2001/XMLSchema-instance" xmlns:pc="http://schemas.microsoft.com/office/infopath/2007/PartnerControls">
+  <documentManagement>
+    <TaxCatchAll xmlns="6a3343e3-a342-4977-82e8-547b9d40dd28" xsi:nil="true"/>
+    <lcf76f155ced4ddcb4097134ff3c332f xmlns="122b6bc9-85c8-4cf1-91e6-8e70987f848c">
+      <Terms xmlns="http://schemas.microsoft.com/office/infopath/2007/PartnerControls"/>
+    </lcf76f155ced4ddcb4097134ff3c332f>
+  </documentManagement>
+</p:properties>
+</file>
+
+<file path=customXml/item2.xml><?xml version="1.0" encoding="utf-8"?>
 <ct:contentTypeSchema xmlns:ct="http://schemas.microsoft.com/office/2006/metadata/contentType" xmlns:ma="http://schemas.microsoft.com/office/2006/metadata/properties/metaAttributes" ct:_="" ma:_="" ma:contentTypeName="Document" ma:contentTypeID="0x010100DAB4865CE0063E4C863866F234696B4D" ma:contentTypeVersion="11" ma:contentTypeDescription="Create a new document." ma:contentTypeScope="" ma:versionID="dc68f9ba90de6bdc71dcd44eaa64d902">
   <xsd:schema xmlns:xsd="http://www.w3.org/2001/XMLSchema" xmlns:xs="http://www.w3.org/2001/XMLSchema" xmlns:p="http://schemas.microsoft.com/office/2006/metadata/properties" xmlns:ns2="122b6bc9-85c8-4cf1-91e6-8e70987f848c" xmlns:ns3="6a3343e3-a342-4977-82e8-547b9d40dd28" targetNamespace="http://schemas.microsoft.com/office/2006/metadata/properties" ma:root="true" ma:fieldsID="14f7a31914c7b408390499466c8b176f" ns2:_="" ns3:_="">
     <xsd:import namespace="122b6bc9-85c8-4cf1-91e6-8e70987f848c"/>
@@ -4576,17 +4599,6 @@
 </ct:contentTypeSchema>
 </file>
 
-<file path=customXml/item2.xml><?xml version="1.0" encoding="utf-8"?>
-<p:properties xmlns:p="http://schemas.microsoft.com/office/2006/metadata/properties" xmlns:xsi="http://www.w3.org/2001/XMLSchema-instance" xmlns:pc="http://schemas.microsoft.com/office/infopath/2007/PartnerControls">
-  <documentManagement>
-    <TaxCatchAll xmlns="6a3343e3-a342-4977-82e8-547b9d40dd28" xsi:nil="true"/>
-    <lcf76f155ced4ddcb4097134ff3c332f xmlns="122b6bc9-85c8-4cf1-91e6-8e70987f848c">
-      <Terms xmlns="http://schemas.microsoft.com/office/infopath/2007/PartnerControls"/>
-    </lcf76f155ced4ddcb4097134ff3c332f>
-  </documentManagement>
-</p:properties>
-</file>
-
 <file path=customXml/item3.xml><?xml version="1.0" encoding="utf-8"?>
 <?mso-contentType ?>
 <FormTemplates xmlns="http://schemas.microsoft.com/sharepoint/v3/contenttype/forms">
@@ -4597,6 +4609,17 @@
 </file>
 
 <file path=customXml/itemProps1.xml><?xml version="1.0" encoding="utf-8"?>
+<ds:datastoreItem xmlns:ds="http://schemas.openxmlformats.org/officeDocument/2006/customXml" ds:itemID="{68F97C91-8AAA-4241-BFB3-79DE058C21C2}">
+  <ds:schemaRefs>
+    <ds:schemaRef ds:uri="http://schemas.microsoft.com/office/2006/metadata/properties"/>
+    <ds:schemaRef ds:uri="http://schemas.microsoft.com/office/infopath/2007/PartnerControls"/>
+    <ds:schemaRef ds:uri="6a3343e3-a342-4977-82e8-547b9d40dd28"/>
+    <ds:schemaRef ds:uri="122b6bc9-85c8-4cf1-91e6-8e70987f848c"/>
+  </ds:schemaRefs>
+</ds:datastoreItem>
+</file>
+
+<file path=customXml/itemProps2.xml><?xml version="1.0" encoding="utf-8"?>
 <ds:datastoreItem xmlns:ds="http://schemas.openxmlformats.org/officeDocument/2006/customXml" ds:itemID="{4D2E664C-9446-4AF3-8769-3CCB10B810F7}">
   <ds:schemaRefs>
     <ds:schemaRef ds:uri="http://schemas.microsoft.com/office/2006/metadata/contentType"/>
@@ -4615,17 +4638,6 @@
 </ds:datastoreItem>
 </file>
 
-<file path=customXml/itemProps2.xml><?xml version="1.0" encoding="utf-8"?>
-<ds:datastoreItem xmlns:ds="http://schemas.openxmlformats.org/officeDocument/2006/customXml" ds:itemID="{68F97C91-8AAA-4241-BFB3-79DE058C21C2}">
-  <ds:schemaRefs>
-    <ds:schemaRef ds:uri="http://schemas.microsoft.com/office/2006/metadata/properties"/>
-    <ds:schemaRef ds:uri="http://schemas.microsoft.com/office/infopath/2007/PartnerControls"/>
-    <ds:schemaRef ds:uri="6a3343e3-a342-4977-82e8-547b9d40dd28"/>
-    <ds:schemaRef ds:uri="122b6bc9-85c8-4cf1-91e6-8e70987f848c"/>
-  </ds:schemaRefs>
-</ds:datastoreItem>
-</file>
-
 <file path=customXml/itemProps3.xml><?xml version="1.0" encoding="utf-8"?>
 <ds:datastoreItem xmlns:ds="http://schemas.openxmlformats.org/officeDocument/2006/customXml" ds:itemID="{016BB153-861F-4192-A688-0C944E34872E}">
   <ds:schemaRefs>

</xml_diff>